<commit_message>
Populate assessment report with data from source spreadsheets
Co-Authored-By: Claude Sonnet 5.5 <noreply@anthropic.com>
Claude-Session: https://claude.ai/code/session_017ByFSMFKb6FYEauyGXdXkT
</commit_message>
<xml_diff>
--- a/Advice_Financial_SharePoint_Assessment.docx
+++ b/Advice_Financial_SharePoint_Assessment.docx
@@ -661,6 +661,36 @@
     </w:p>
     <w:p>
       <w:pPr>
+        <w:pStyle w:val="ListParagraph"/>
+        <w:jc w:val="left"/>
+      </w:pPr>
+      <w:r>
+        <w:rPr/>
+        <w:t xml:space="preserve">The "Everyone except external users" report lists 280 shared items, 263 of them in AF Client Portal and 270 with Edit rights</w:t>
+      </w:r>
+    </w:p>
+    <w:p>
+      <w:pPr>
+        <w:pStyle w:val="ListParagraph"/>
+        <w:jc w:val="left"/>
+      </w:pPr>
+      <w:r>
+        <w:rPr/>
+        <w:t xml:space="preserve">Eleven OneDrive accounts hold 331,318 files and 489 "Anyone" links; the admin OneDrive alone holds 235,208 files and 152 links</w:t>
+      </w:r>
+    </w:p>
+    <w:p>
+      <w:pPr>
+        <w:pStyle w:val="ListParagraph"/>
+        <w:jc w:val="left"/>
+      </w:pPr>
+      <w:r>
+        <w:rPr/>
+        <w:t xml:space="preserve">Seven of the eight SharePoint sites have no primary admin, none has a sensitivity label and none is joined to a hub</w:t>
+      </w:r>
+    </w:p>
+    <w:p>
+      <w:pPr>
         <w:pStyle w:val="WarningBox"/>
         <w:jc w:val="left"/>
       </w:pPr>
@@ -1262,7 +1292,7 @@
       <w:r>
         <w:drawing>
           <wp:inline distT="0" distB="0" distL="0" distR="0">
-            <wp:extent cx="5040000" cy="2193764"/>
+            <wp:extent cx="5040000" cy="2387749"/>
             <wp:docPr id="103" name="storage.png" descr="Horizontal bar chart of SharePoint site storage consumption"/>
             <wp:cNvGraphicFramePr>
               <a:graphicFrameLocks xmlns:a="http://schemas.openxmlformats.org/drawingml/2006/main" noChangeAspect="1"/>
@@ -1283,7 +1313,7 @@
                   <pic:spPr>
                     <a:xfrm>
                       <a:off x="0" y="0"/>
-                      <a:ext cx="5040000" cy="2193764"/>
+                      <a:ext cx="5040000" cy="2387749"/>
                     </a:xfrm>
                     <a:prstGeom prst="rect">
                       <a:avLst/>
@@ -1308,20 +1338,7 @@
           <w:sz w:val="16"/>
           <w:szCs w:val="16"/>
         </w:rPr>
-        <w:t xml:space="preserve">Figure 2: SharePoint site storage consumption. Only the AF Client Portal figure was supplied in the brief; populate the remaining bars from AllSitesActiveFinance.xlsx.</w:t>
-      </w:r>
-    </w:p>
-    <w:p>
-      <w:pPr>
-        <w:pStyle w:val="Heading1"/>
-        <w:pageBreakBefore/>
-        <w:pBdr>
-          <w:bottom w:val="single" w:sz="18" w:space="4" w:color="E60012"/>
-        </w:pBdr>
-      </w:pPr>
-      <w:r>
-        <w:rPr/>
-        <w:t xml:space="preserve">Section 2: Risk Assessment</w:t>
+        <w:t xml:space="preserve">Figure 2: SharePoint site storage consumption (source: AllSitesActiveFinance.xlsx). The four sites grouped as "Other sites" each use 0 GB.</w:t>
       </w:r>
     </w:p>
     <w:p>
@@ -1332,8 +1349,2406 @@
       </w:pPr>
       <w:r>
         <w:rPr/>
-        <w:t xml:space="preserve">Information Risk Overview</w:t>
-      </w:r>
+        <w:t xml:space="preserve">SharePoint Site Inventory</w:t>
+      </w:r>
+    </w:p>
+    <w:tbl>
+      <w:tblPr>
+        <w:tblStyle w:val="RicohTableStyle"/>
+        <w:tblW w:w="8929" w:type="dxa"/>
+        <w:tblLayout w:type="fixed"/>
+        <w:tblLook w:val="04A0" w:firstRow="1" w:lastRow="0" w:firstColumn="0" w:lastColumn="0" w:noHBand="0" w:noVBand="1"/>
+      </w:tblPr>
+      <w:tblGrid>
+        <w:gridCol w:w="2700"/>
+        <w:gridCol w:w="1700"/>
+        <w:gridCol w:w="700"/>
+        <w:gridCol w:w="900"/>
+        <w:gridCol w:w="1500"/>
+        <w:gridCol w:w="1429"/>
+      </w:tblGrid>
+      <w:tr>
+        <w:trPr>
+          <w:cantSplit/>
+          <w:tblHeader/>
+        </w:trPr>
+        <w:tc>
+          <w:tcPr>
+            <w:tcW w:w="2700" w:type="dxa"/>
+          </w:tcPr>
+          <w:p>
+            <w:pPr>
+              <w:spacing w:before="40" w:after="40"/>
+              <w:jc w:val="left"/>
+            </w:pPr>
+            <w:r>
+              <w:rPr>
+                <w:b/>
+                <w:color w:val="FFFFFF"/>
+                <w:sz w:val="20"/>
+                <w:szCs w:val="20"/>
+              </w:rPr>
+              <w:t xml:space="preserve">Site</w:t>
+            </w:r>
+          </w:p>
+        </w:tc>
+        <w:tc>
+          <w:tcPr>
+            <w:tcW w:w="1700" w:type="dxa"/>
+          </w:tcPr>
+          <w:p>
+            <w:pPr>
+              <w:spacing w:before="40" w:after="40"/>
+              <w:jc w:val="left"/>
+            </w:pPr>
+            <w:r>
+              <w:rPr>
+                <w:b/>
+                <w:color w:val="FFFFFF"/>
+                <w:sz w:val="20"/>
+                <w:szCs w:val="20"/>
+              </w:rPr>
+              <w:t xml:space="preserve">Template</w:t>
+            </w:r>
+          </w:p>
+        </w:tc>
+        <w:tc>
+          <w:tcPr>
+            <w:tcW w:w="700" w:type="dxa"/>
+          </w:tcPr>
+          <w:p>
+            <w:pPr>
+              <w:spacing w:before="40" w:after="40"/>
+              <w:jc w:val="left"/>
+            </w:pPr>
+            <w:r>
+              <w:rPr>
+                <w:b/>
+                <w:color w:val="FFFFFF"/>
+                <w:sz w:val="20"/>
+                <w:szCs w:val="20"/>
+              </w:rPr>
+              <w:t xml:space="preserve">GB</w:t>
+            </w:r>
+          </w:p>
+        </w:tc>
+        <w:tc>
+          <w:tcPr>
+            <w:tcW w:w="900" w:type="dxa"/>
+          </w:tcPr>
+          <w:p>
+            <w:pPr>
+              <w:spacing w:before="40" w:after="40"/>
+              <w:jc w:val="left"/>
+            </w:pPr>
+            <w:r>
+              <w:rPr>
+                <w:b/>
+                <w:color w:val="FFFFFF"/>
+                <w:sz w:val="20"/>
+                <w:szCs w:val="20"/>
+              </w:rPr>
+              <w:t xml:space="preserve">Files</w:t>
+            </w:r>
+          </w:p>
+        </w:tc>
+        <w:tc>
+          <w:tcPr>
+            <w:tcW w:w="1500" w:type="dxa"/>
+          </w:tcPr>
+          <w:p>
+            <w:pPr>
+              <w:spacing w:before="40" w:after="40"/>
+              <w:jc w:val="left"/>
+            </w:pPr>
+            <w:r>
+              <w:rPr>
+                <w:b/>
+                <w:color w:val="FFFFFF"/>
+                <w:sz w:val="20"/>
+                <w:szCs w:val="20"/>
+              </w:rPr>
+              <w:t xml:space="preserve">Last activity</w:t>
+            </w:r>
+          </w:p>
+        </w:tc>
+        <w:tc>
+          <w:tcPr>
+            <w:tcW w:w="1429" w:type="dxa"/>
+          </w:tcPr>
+          <w:p>
+            <w:pPr>
+              <w:spacing w:before="40" w:after="40"/>
+              <w:jc w:val="left"/>
+            </w:pPr>
+            <w:r>
+              <w:rPr>
+                <w:b/>
+                <w:color w:val="FFFFFF"/>
+                <w:sz w:val="20"/>
+                <w:szCs w:val="20"/>
+              </w:rPr>
+              <w:t xml:space="preserve">Primary admin</w:t>
+            </w:r>
+          </w:p>
+        </w:tc>
+      </w:tr>
+      <w:tr>
+        <w:trPr>
+          <w:cantSplit/>
+        </w:trPr>
+        <w:tc>
+          <w:tcPr>
+            <w:tcW w:w="2700" w:type="dxa"/>
+          </w:tcPr>
+          <w:p>
+            <w:pPr>
+              <w:spacing w:before="40" w:after="40"/>
+              <w:jc w:val="left"/>
+            </w:pPr>
+            <w:r>
+              <w:rPr>
+                <w:sz w:val="20"/>
+                <w:szCs w:val="20"/>
+              </w:rPr>
+              <w:t xml:space="preserve">AF Client Portal</w:t>
+            </w:r>
+          </w:p>
+        </w:tc>
+        <w:tc>
+          <w:tcPr>
+            <w:tcW w:w="1700" w:type="dxa"/>
+          </w:tcPr>
+          <w:p>
+            <w:pPr>
+              <w:spacing w:before="40" w:after="40"/>
+              <w:jc w:val="left"/>
+            </w:pPr>
+            <w:r>
+              <w:rPr>
+                <w:sz w:val="20"/>
+                <w:szCs w:val="20"/>
+              </w:rPr>
+              <w:t xml:space="preserve">Team site</w:t>
+            </w:r>
+          </w:p>
+        </w:tc>
+        <w:tc>
+          <w:tcPr>
+            <w:tcW w:w="700" w:type="dxa"/>
+          </w:tcPr>
+          <w:p>
+            <w:pPr>
+              <w:spacing w:before="40" w:after="40"/>
+              <w:jc w:val="left"/>
+            </w:pPr>
+            <w:r>
+              <w:rPr>
+                <w:sz w:val="20"/>
+                <w:szCs w:val="20"/>
+              </w:rPr>
+              <w:t xml:space="preserve">104.58</w:t>
+            </w:r>
+          </w:p>
+        </w:tc>
+        <w:tc>
+          <w:tcPr>
+            <w:tcW w:w="900" w:type="dxa"/>
+          </w:tcPr>
+          <w:p>
+            <w:pPr>
+              <w:spacing w:before="40" w:after="40"/>
+              <w:jc w:val="left"/>
+            </w:pPr>
+            <w:r>
+              <w:rPr>
+                <w:sz w:val="20"/>
+                <w:szCs w:val="20"/>
+              </w:rPr>
+              <w:t xml:space="preserve">236,539</w:t>
+            </w:r>
+          </w:p>
+        </w:tc>
+        <w:tc>
+          <w:tcPr>
+            <w:tcW w:w="1500" w:type="dxa"/>
+          </w:tcPr>
+          <w:p>
+            <w:pPr>
+              <w:spacing w:before="40" w:after="40"/>
+              <w:jc w:val="left"/>
+            </w:pPr>
+            <w:r>
+              <w:rPr>
+                <w:sz w:val="20"/>
+                <w:szCs w:val="20"/>
+              </w:rPr>
+              <w:t xml:space="preserve">8 Sep 2026</w:t>
+            </w:r>
+          </w:p>
+        </w:tc>
+        <w:tc>
+          <w:tcPr>
+            <w:tcW w:w="1429" w:type="dxa"/>
+          </w:tcPr>
+          <w:p>
+            <w:pPr>
+              <w:spacing w:before="40" w:after="40"/>
+              <w:jc w:val="left"/>
+            </w:pPr>
+            <w:r>
+              <w:rPr>
+                <w:sz w:val="20"/>
+                <w:szCs w:val="20"/>
+              </w:rPr>
+              <w:t xml:space="preserve">None</w:t>
+            </w:r>
+          </w:p>
+        </w:tc>
+      </w:tr>
+      <w:tr>
+        <w:trPr>
+          <w:cantSplit/>
+        </w:trPr>
+        <w:tc>
+          <w:tcPr>
+            <w:tcW w:w="2700" w:type="dxa"/>
+          </w:tcPr>
+          <w:p>
+            <w:pPr>
+              <w:spacing w:before="40" w:after="40"/>
+              <w:jc w:val="left"/>
+            </w:pPr>
+            <w:r>
+              <w:rPr>
+                <w:sz w:val="20"/>
+                <w:szCs w:val="20"/>
+              </w:rPr>
+              <w:t xml:space="preserve">Advice Financial Ltd Team Site</w:t>
+            </w:r>
+          </w:p>
+        </w:tc>
+        <w:tc>
+          <w:tcPr>
+            <w:tcW w:w="1700" w:type="dxa"/>
+          </w:tcPr>
+          <w:p>
+            <w:pPr>
+              <w:spacing w:before="40" w:after="40"/>
+              <w:jc w:val="left"/>
+            </w:pPr>
+            <w:r>
+              <w:rPr>
+                <w:sz w:val="20"/>
+                <w:szCs w:val="20"/>
+              </w:rPr>
+              <w:t xml:space="preserve">Team site (classic)</w:t>
+            </w:r>
+          </w:p>
+        </w:tc>
+        <w:tc>
+          <w:tcPr>
+            <w:tcW w:w="700" w:type="dxa"/>
+          </w:tcPr>
+          <w:p>
+            <w:pPr>
+              <w:spacing w:before="40" w:after="40"/>
+              <w:jc w:val="left"/>
+            </w:pPr>
+            <w:r>
+              <w:rPr>
+                <w:sz w:val="20"/>
+                <w:szCs w:val="20"/>
+              </w:rPr>
+              <w:t xml:space="preserve">14.94</w:t>
+            </w:r>
+          </w:p>
+        </w:tc>
+        <w:tc>
+          <w:tcPr>
+            <w:tcW w:w="900" w:type="dxa"/>
+          </w:tcPr>
+          <w:p>
+            <w:pPr>
+              <w:spacing w:before="40" w:after="40"/>
+              <w:jc w:val="left"/>
+            </w:pPr>
+            <w:r>
+              <w:rPr>
+                <w:sz w:val="20"/>
+                <w:szCs w:val="20"/>
+              </w:rPr>
+              <w:t xml:space="preserve">18,163</w:t>
+            </w:r>
+          </w:p>
+        </w:tc>
+        <w:tc>
+          <w:tcPr>
+            <w:tcW w:w="1500" w:type="dxa"/>
+          </w:tcPr>
+          <w:p>
+            <w:pPr>
+              <w:spacing w:before="40" w:after="40"/>
+              <w:jc w:val="left"/>
+            </w:pPr>
+            <w:r>
+              <w:rPr>
+                <w:sz w:val="20"/>
+                <w:szCs w:val="20"/>
+              </w:rPr>
+              <w:t xml:space="preserve">8 Sep 2026</w:t>
+            </w:r>
+          </w:p>
+        </w:tc>
+        <w:tc>
+          <w:tcPr>
+            <w:tcW w:w="1429" w:type="dxa"/>
+          </w:tcPr>
+          <w:p>
+            <w:pPr>
+              <w:spacing w:before="40" w:after="40"/>
+              <w:jc w:val="left"/>
+            </w:pPr>
+            <w:r>
+              <w:rPr>
+                <w:sz w:val="20"/>
+                <w:szCs w:val="20"/>
+              </w:rPr>
+              <w:t xml:space="preserve">System Account</w:t>
+            </w:r>
+          </w:p>
+        </w:tc>
+      </w:tr>
+      <w:tr>
+        <w:trPr>
+          <w:cantSplit/>
+        </w:trPr>
+        <w:tc>
+          <w:tcPr>
+            <w:tcW w:w="2700" w:type="dxa"/>
+          </w:tcPr>
+          <w:p>
+            <w:pPr>
+              <w:spacing w:before="40" w:after="40"/>
+              <w:jc w:val="left"/>
+            </w:pPr>
+            <w:r>
+              <w:rPr>
+                <w:sz w:val="20"/>
+                <w:szCs w:val="20"/>
+              </w:rPr>
+              <w:t xml:space="preserve">IBG</w:t>
+            </w:r>
+          </w:p>
+        </w:tc>
+        <w:tc>
+          <w:tcPr>
+            <w:tcW w:w="1700" w:type="dxa"/>
+          </w:tcPr>
+          <w:p>
+            <w:pPr>
+              <w:spacing w:before="40" w:after="40"/>
+              <w:jc w:val="left"/>
+            </w:pPr>
+            <w:r>
+              <w:rPr>
+                <w:sz w:val="20"/>
+                <w:szCs w:val="20"/>
+              </w:rPr>
+              <w:t xml:space="preserve">Document Center</w:t>
+            </w:r>
+          </w:p>
+        </w:tc>
+        <w:tc>
+          <w:tcPr>
+            <w:tcW w:w="700" w:type="dxa"/>
+          </w:tcPr>
+          <w:p>
+            <w:pPr>
+              <w:spacing w:before="40" w:after="40"/>
+              <w:jc w:val="left"/>
+            </w:pPr>
+            <w:r>
+              <w:rPr>
+                <w:sz w:val="20"/>
+                <w:szCs w:val="20"/>
+              </w:rPr>
+              <w:t xml:space="preserve">2.43</w:t>
+            </w:r>
+          </w:p>
+        </w:tc>
+        <w:tc>
+          <w:tcPr>
+            <w:tcW w:w="900" w:type="dxa"/>
+          </w:tcPr>
+          <w:p>
+            <w:pPr>
+              <w:spacing w:before="40" w:after="40"/>
+              <w:jc w:val="left"/>
+            </w:pPr>
+            <w:r>
+              <w:rPr>
+                <w:sz w:val="20"/>
+                <w:szCs w:val="20"/>
+              </w:rPr>
+              <w:t xml:space="preserve">712</w:t>
+            </w:r>
+          </w:p>
+        </w:tc>
+        <w:tc>
+          <w:tcPr>
+            <w:tcW w:w="1500" w:type="dxa"/>
+          </w:tcPr>
+          <w:p>
+            <w:pPr>
+              <w:spacing w:before="40" w:after="40"/>
+              <w:jc w:val="left"/>
+            </w:pPr>
+            <w:r>
+              <w:rPr>
+                <w:sz w:val="20"/>
+                <w:szCs w:val="20"/>
+              </w:rPr>
+              <w:t xml:space="preserve">23 Oct 2024</w:t>
+            </w:r>
+          </w:p>
+        </w:tc>
+        <w:tc>
+          <w:tcPr>
+            <w:tcW w:w="1429" w:type="dxa"/>
+          </w:tcPr>
+          <w:p>
+            <w:pPr>
+              <w:spacing w:before="40" w:after="40"/>
+              <w:jc w:val="left"/>
+            </w:pPr>
+            <w:r>
+              <w:rPr>
+                <w:sz w:val="20"/>
+                <w:szCs w:val="20"/>
+              </w:rPr>
+              <w:t xml:space="preserve">None</w:t>
+            </w:r>
+          </w:p>
+        </w:tc>
+      </w:tr>
+      <w:tr>
+        <w:trPr>
+          <w:cantSplit/>
+        </w:trPr>
+        <w:tc>
+          <w:tcPr>
+            <w:tcW w:w="2700" w:type="dxa"/>
+          </w:tcPr>
+          <w:p>
+            <w:pPr>
+              <w:spacing w:before="40" w:after="40"/>
+              <w:jc w:val="left"/>
+            </w:pPr>
+            <w:r>
+              <w:rPr>
+                <w:sz w:val="20"/>
+                <w:szCs w:val="20"/>
+              </w:rPr>
+              <w:t xml:space="preserve">Georges Mortgages</w:t>
+            </w:r>
+          </w:p>
+        </w:tc>
+        <w:tc>
+          <w:tcPr>
+            <w:tcW w:w="1700" w:type="dxa"/>
+          </w:tcPr>
+          <w:p>
+            <w:pPr>
+              <w:spacing w:before="40" w:after="40"/>
+              <w:jc w:val="left"/>
+            </w:pPr>
+            <w:r>
+              <w:rPr>
+                <w:sz w:val="20"/>
+                <w:szCs w:val="20"/>
+              </w:rPr>
+              <w:t xml:space="preserve">Team site</w:t>
+            </w:r>
+          </w:p>
+        </w:tc>
+        <w:tc>
+          <w:tcPr>
+            <w:tcW w:w="700" w:type="dxa"/>
+          </w:tcPr>
+          <w:p>
+            <w:pPr>
+              <w:spacing w:before="40" w:after="40"/>
+              <w:jc w:val="left"/>
+            </w:pPr>
+            <w:r>
+              <w:rPr>
+                <w:sz w:val="20"/>
+                <w:szCs w:val="20"/>
+              </w:rPr>
+              <w:t xml:space="preserve">0</w:t>
+            </w:r>
+          </w:p>
+        </w:tc>
+        <w:tc>
+          <w:tcPr>
+            <w:tcW w:w="900" w:type="dxa"/>
+          </w:tcPr>
+          <w:p>
+            <w:pPr>
+              <w:spacing w:before="40" w:after="40"/>
+              <w:jc w:val="left"/>
+            </w:pPr>
+            <w:r>
+              <w:rPr>
+                <w:sz w:val="20"/>
+                <w:szCs w:val="20"/>
+              </w:rPr>
+              <w:t xml:space="preserve">2</w:t>
+            </w:r>
+          </w:p>
+        </w:tc>
+        <w:tc>
+          <w:tcPr>
+            <w:tcW w:w="1500" w:type="dxa"/>
+          </w:tcPr>
+          <w:p>
+            <w:pPr>
+              <w:spacing w:before="40" w:after="40"/>
+              <w:jc w:val="left"/>
+            </w:pPr>
+            <w:r>
+              <w:rPr>
+                <w:sz w:val="20"/>
+                <w:szCs w:val="20"/>
+              </w:rPr>
+              <w:t xml:space="preserve">13 Jul 2026</w:t>
+            </w:r>
+          </w:p>
+        </w:tc>
+        <w:tc>
+          <w:tcPr>
+            <w:tcW w:w="1429" w:type="dxa"/>
+          </w:tcPr>
+          <w:p>
+            <w:pPr>
+              <w:spacing w:before="40" w:after="40"/>
+              <w:jc w:val="left"/>
+            </w:pPr>
+            <w:r>
+              <w:rPr>
+                <w:sz w:val="20"/>
+                <w:szCs w:val="20"/>
+              </w:rPr>
+              <w:t xml:space="preserve">None</w:t>
+            </w:r>
+          </w:p>
+        </w:tc>
+      </w:tr>
+      <w:tr>
+        <w:trPr>
+          <w:cantSplit/>
+        </w:trPr>
+        <w:tc>
+          <w:tcPr>
+            <w:tcW w:w="2700" w:type="dxa"/>
+          </w:tcPr>
+          <w:p>
+            <w:pPr>
+              <w:spacing w:before="40" w:after="40"/>
+              <w:jc w:val="left"/>
+            </w:pPr>
+            <w:r>
+              <w:rPr>
+                <w:sz w:val="20"/>
+                <w:szCs w:val="20"/>
+              </w:rPr>
+              <w:t xml:space="preserve">testCLIENT PORTAL</w:t>
+            </w:r>
+          </w:p>
+        </w:tc>
+        <w:tc>
+          <w:tcPr>
+            <w:tcW w:w="1700" w:type="dxa"/>
+          </w:tcPr>
+          <w:p>
+            <w:pPr>
+              <w:spacing w:before="40" w:after="40"/>
+              <w:jc w:val="left"/>
+            </w:pPr>
+            <w:r>
+              <w:rPr>
+                <w:sz w:val="20"/>
+                <w:szCs w:val="20"/>
+              </w:rPr>
+              <w:t xml:space="preserve">Team site</w:t>
+            </w:r>
+          </w:p>
+        </w:tc>
+        <w:tc>
+          <w:tcPr>
+            <w:tcW w:w="700" w:type="dxa"/>
+          </w:tcPr>
+          <w:p>
+            <w:pPr>
+              <w:spacing w:before="40" w:after="40"/>
+              <w:jc w:val="left"/>
+            </w:pPr>
+            <w:r>
+              <w:rPr>
+                <w:sz w:val="20"/>
+                <w:szCs w:val="20"/>
+              </w:rPr>
+              <w:t xml:space="preserve">0</w:t>
+            </w:r>
+          </w:p>
+        </w:tc>
+        <w:tc>
+          <w:tcPr>
+            <w:tcW w:w="900" w:type="dxa"/>
+          </w:tcPr>
+          <w:p>
+            <w:pPr>
+              <w:spacing w:before="40" w:after="40"/>
+              <w:jc w:val="left"/>
+            </w:pPr>
+            <w:r>
+              <w:rPr>
+                <w:sz w:val="20"/>
+                <w:szCs w:val="20"/>
+              </w:rPr>
+              <w:t xml:space="preserve">8</w:t>
+            </w:r>
+          </w:p>
+        </w:tc>
+        <w:tc>
+          <w:tcPr>
+            <w:tcW w:w="1500" w:type="dxa"/>
+          </w:tcPr>
+          <w:p>
+            <w:pPr>
+              <w:spacing w:before="40" w:after="40"/>
+              <w:jc w:val="left"/>
+            </w:pPr>
+            <w:r>
+              <w:rPr>
+                <w:sz w:val="20"/>
+                <w:szCs w:val="20"/>
+              </w:rPr>
+              <w:t xml:space="preserve">2 Sep 2026</w:t>
+            </w:r>
+          </w:p>
+        </w:tc>
+        <w:tc>
+          <w:tcPr>
+            <w:tcW w:w="1429" w:type="dxa"/>
+          </w:tcPr>
+          <w:p>
+            <w:pPr>
+              <w:spacing w:before="40" w:after="40"/>
+              <w:jc w:val="left"/>
+            </w:pPr>
+            <w:r>
+              <w:rPr>
+                <w:sz w:val="20"/>
+                <w:szCs w:val="20"/>
+              </w:rPr>
+              <w:t xml:space="preserve">None</w:t>
+            </w:r>
+          </w:p>
+        </w:tc>
+      </w:tr>
+      <w:tr>
+        <w:trPr>
+          <w:cantSplit/>
+        </w:trPr>
+        <w:tc>
+          <w:tcPr>
+            <w:tcW w:w="2700" w:type="dxa"/>
+          </w:tcPr>
+          <w:p>
+            <w:pPr>
+              <w:spacing w:before="40" w:after="40"/>
+              <w:jc w:val="left"/>
+            </w:pPr>
+            <w:r>
+              <w:rPr>
+                <w:sz w:val="20"/>
+                <w:szCs w:val="20"/>
+              </w:rPr>
+              <w:t xml:space="preserve">All Company</w:t>
+            </w:r>
+          </w:p>
+        </w:tc>
+        <w:tc>
+          <w:tcPr>
+            <w:tcW w:w="1700" w:type="dxa"/>
+          </w:tcPr>
+          <w:p>
+            <w:pPr>
+              <w:spacing w:before="40" w:after="40"/>
+              <w:jc w:val="left"/>
+            </w:pPr>
+            <w:r>
+              <w:rPr>
+                <w:sz w:val="20"/>
+                <w:szCs w:val="20"/>
+              </w:rPr>
+              <w:t xml:space="preserve">Team site</w:t>
+            </w:r>
+          </w:p>
+        </w:tc>
+        <w:tc>
+          <w:tcPr>
+            <w:tcW w:w="700" w:type="dxa"/>
+          </w:tcPr>
+          <w:p>
+            <w:pPr>
+              <w:spacing w:before="40" w:after="40"/>
+              <w:jc w:val="left"/>
+            </w:pPr>
+            <w:r>
+              <w:rPr>
+                <w:sz w:val="20"/>
+                <w:szCs w:val="20"/>
+              </w:rPr>
+              <w:t xml:space="preserve">0</w:t>
+            </w:r>
+          </w:p>
+        </w:tc>
+        <w:tc>
+          <w:tcPr>
+            <w:tcW w:w="900" w:type="dxa"/>
+          </w:tcPr>
+          <w:p>
+            <w:pPr>
+              <w:spacing w:before="40" w:after="40"/>
+              <w:jc w:val="left"/>
+            </w:pPr>
+            <w:r>
+              <w:rPr>
+                <w:sz w:val="20"/>
+                <w:szCs w:val="20"/>
+              </w:rPr>
+              <w:t xml:space="preserve">4</w:t>
+            </w:r>
+          </w:p>
+        </w:tc>
+        <w:tc>
+          <w:tcPr>
+            <w:tcW w:w="1500" w:type="dxa"/>
+          </w:tcPr>
+          <w:p>
+            <w:pPr>
+              <w:spacing w:before="40" w:after="40"/>
+              <w:jc w:val="left"/>
+            </w:pPr>
+            <w:r>
+              <w:rPr>
+                <w:sz w:val="20"/>
+                <w:szCs w:val="20"/>
+              </w:rPr>
+              <w:t xml:space="preserve">10 Dec 2025</w:t>
+            </w:r>
+          </w:p>
+        </w:tc>
+        <w:tc>
+          <w:tcPr>
+            <w:tcW w:w="1429" w:type="dxa"/>
+          </w:tcPr>
+          <w:p>
+            <w:pPr>
+              <w:spacing w:before="40" w:after="40"/>
+              <w:jc w:val="left"/>
+            </w:pPr>
+            <w:r>
+              <w:rPr>
+                <w:sz w:val="20"/>
+                <w:szCs w:val="20"/>
+              </w:rPr>
+              <w:t xml:space="preserve">None</w:t>
+            </w:r>
+          </w:p>
+        </w:tc>
+      </w:tr>
+      <w:tr>
+        <w:trPr>
+          <w:cantSplit/>
+        </w:trPr>
+        <w:tc>
+          <w:tcPr>
+            <w:tcW w:w="2700" w:type="dxa"/>
+          </w:tcPr>
+          <w:p>
+            <w:pPr>
+              <w:spacing w:before="40" w:after="40"/>
+              <w:jc w:val="left"/>
+            </w:pPr>
+            <w:r>
+              <w:rPr>
+                <w:sz w:val="20"/>
+                <w:szCs w:val="20"/>
+              </w:rPr>
+              <w:t xml:space="preserve">AFFINITY GROUP CALCULATORS</w:t>
+            </w:r>
+          </w:p>
+        </w:tc>
+        <w:tc>
+          <w:tcPr>
+            <w:tcW w:w="1700" w:type="dxa"/>
+          </w:tcPr>
+          <w:p>
+            <w:pPr>
+              <w:spacing w:before="40" w:after="40"/>
+              <w:jc w:val="left"/>
+            </w:pPr>
+            <w:r>
+              <w:rPr>
+                <w:sz w:val="20"/>
+                <w:szCs w:val="20"/>
+              </w:rPr>
+              <w:t xml:space="preserve">Team site</w:t>
+            </w:r>
+          </w:p>
+        </w:tc>
+        <w:tc>
+          <w:tcPr>
+            <w:tcW w:w="700" w:type="dxa"/>
+          </w:tcPr>
+          <w:p>
+            <w:pPr>
+              <w:spacing w:before="40" w:after="40"/>
+              <w:jc w:val="left"/>
+            </w:pPr>
+            <w:r>
+              <w:rPr>
+                <w:sz w:val="20"/>
+                <w:szCs w:val="20"/>
+              </w:rPr>
+              <w:t xml:space="preserve">0</w:t>
+            </w:r>
+          </w:p>
+        </w:tc>
+        <w:tc>
+          <w:tcPr>
+            <w:tcW w:w="900" w:type="dxa"/>
+          </w:tcPr>
+          <w:p>
+            <w:pPr>
+              <w:spacing w:before="40" w:after="40"/>
+              <w:jc w:val="left"/>
+            </w:pPr>
+            <w:r>
+              <w:rPr>
+                <w:sz w:val="20"/>
+                <w:szCs w:val="20"/>
+              </w:rPr>
+              <w:t xml:space="preserve">2</w:t>
+            </w:r>
+          </w:p>
+        </w:tc>
+        <w:tc>
+          <w:tcPr>
+            <w:tcW w:w="1500" w:type="dxa"/>
+          </w:tcPr>
+          <w:p>
+            <w:pPr>
+              <w:spacing w:before="40" w:after="40"/>
+              <w:jc w:val="left"/>
+            </w:pPr>
+            <w:r>
+              <w:rPr>
+                <w:sz w:val="20"/>
+                <w:szCs w:val="20"/>
+              </w:rPr>
+              <w:t xml:space="preserve">20 May 2024</w:t>
+            </w:r>
+          </w:p>
+        </w:tc>
+        <w:tc>
+          <w:tcPr>
+            <w:tcW w:w="1429" w:type="dxa"/>
+          </w:tcPr>
+          <w:p>
+            <w:pPr>
+              <w:spacing w:before="40" w:after="40"/>
+              <w:jc w:val="left"/>
+            </w:pPr>
+            <w:r>
+              <w:rPr>
+                <w:sz w:val="20"/>
+                <w:szCs w:val="20"/>
+              </w:rPr>
+              <w:t xml:space="preserve">None</w:t>
+            </w:r>
+          </w:p>
+        </w:tc>
+      </w:tr>
+      <w:tr>
+        <w:trPr>
+          <w:cantSplit/>
+        </w:trPr>
+        <w:tc>
+          <w:tcPr>
+            <w:tcW w:w="2700" w:type="dxa"/>
+          </w:tcPr>
+          <w:p>
+            <w:pPr>
+              <w:spacing w:before="40" w:after="40"/>
+              <w:jc w:val="left"/>
+            </w:pPr>
+            <w:r>
+              <w:rPr>
+                <w:sz w:val="20"/>
+                <w:szCs w:val="20"/>
+              </w:rPr>
+              <w:t xml:space="preserve">Zips</w:t>
+            </w:r>
+          </w:p>
+        </w:tc>
+        <w:tc>
+          <w:tcPr>
+            <w:tcW w:w="1700" w:type="dxa"/>
+          </w:tcPr>
+          <w:p>
+            <w:pPr>
+              <w:spacing w:before="40" w:after="40"/>
+              <w:jc w:val="left"/>
+            </w:pPr>
+            <w:r>
+              <w:rPr>
+                <w:sz w:val="20"/>
+                <w:szCs w:val="20"/>
+              </w:rPr>
+              <w:t xml:space="preserve">Communication site</w:t>
+            </w:r>
+          </w:p>
+        </w:tc>
+        <w:tc>
+          <w:tcPr>
+            <w:tcW w:w="700" w:type="dxa"/>
+          </w:tcPr>
+          <w:p>
+            <w:pPr>
+              <w:spacing w:before="40" w:after="40"/>
+              <w:jc w:val="left"/>
+            </w:pPr>
+            <w:r>
+              <w:rPr>
+                <w:sz w:val="20"/>
+                <w:szCs w:val="20"/>
+              </w:rPr>
+              <w:t xml:space="preserve">0</w:t>
+            </w:r>
+          </w:p>
+        </w:tc>
+        <w:tc>
+          <w:tcPr>
+            <w:tcW w:w="900" w:type="dxa"/>
+          </w:tcPr>
+          <w:p>
+            <w:pPr>
+              <w:spacing w:before="40" w:after="40"/>
+              <w:jc w:val="left"/>
+            </w:pPr>
+            <w:r>
+              <w:rPr>
+                <w:sz w:val="20"/>
+                <w:szCs w:val="20"/>
+              </w:rPr>
+              <w:t xml:space="preserve">3</w:t>
+            </w:r>
+          </w:p>
+        </w:tc>
+        <w:tc>
+          <w:tcPr>
+            <w:tcW w:w="1500" w:type="dxa"/>
+          </w:tcPr>
+          <w:p>
+            <w:pPr>
+              <w:spacing w:before="40" w:after="40"/>
+              <w:jc w:val="left"/>
+            </w:pPr>
+            <w:r>
+              <w:rPr>
+                <w:sz w:val="20"/>
+                <w:szCs w:val="20"/>
+              </w:rPr>
+              <w:t xml:space="preserve">20 May 2024</w:t>
+            </w:r>
+          </w:p>
+        </w:tc>
+        <w:tc>
+          <w:tcPr>
+            <w:tcW w:w="1429" w:type="dxa"/>
+          </w:tcPr>
+          <w:p>
+            <w:pPr>
+              <w:spacing w:before="40" w:after="40"/>
+              <w:jc w:val="left"/>
+            </w:pPr>
+            <w:r>
+              <w:rPr>
+                <w:sz w:val="20"/>
+                <w:szCs w:val="20"/>
+              </w:rPr>
+              <w:t xml:space="preserve">None</w:t>
+            </w:r>
+          </w:p>
+        </w:tc>
+      </w:tr>
+    </w:tbl>
+    <w:p>
+      <w:pPr>
+        <w:spacing w:after="120"/>
+      </w:pPr>
+    </w:p>
+    <w:p>
+      <w:pPr>
+        <w:pStyle w:val="Heading3"/>
+        <w:keepNext/>
+      </w:pPr>
+      <w:r>
+        <w:rPr/>
+        <w:t xml:space="preserve">Governance observations from the site inventory</w:t>
+      </w:r>
+    </w:p>
+    <w:p>
+      <w:pPr>
+        <w:pStyle w:val="ListParagraph"/>
+        <w:jc w:val="left"/>
+      </w:pPr>
+      <w:r>
+        <w:rPr/>
+        <w:t xml:space="preserve">Total storage is 121.95 GB across 255,433 files; AF Client Portal holds 86% of the storage and 93% of the files</w:t>
+      </w:r>
+    </w:p>
+    <w:p>
+      <w:pPr>
+        <w:pStyle w:val="ListParagraph"/>
+        <w:jc w:val="left"/>
+      </w:pPr>
+      <w:r>
+        <w:rPr/>
+        <w:t xml:space="preserve">Seven of eight sites have no primary admin recorded</w:t>
+      </w:r>
+    </w:p>
+    <w:p>
+      <w:pPr>
+        <w:pStyle w:val="ListParagraph"/>
+        <w:jc w:val="left"/>
+      </w:pPr>
+      <w:r>
+        <w:rPr/>
+        <w:t xml:space="preserve">No site carries a sensitivity label and no site is associated with a hub</w:t>
+      </w:r>
+    </w:p>
+    <w:p>
+      <w:pPr>
+        <w:pStyle w:val="ListParagraph"/>
+        <w:jc w:val="left"/>
+      </w:pPr>
+      <w:r>
+        <w:rPr/>
+        <w:t xml:space="preserve">External sharing is on for six of the eight sites; only IBG and Zips have it off</w:t>
+      </w:r>
+    </w:p>
+    <w:p>
+      <w:pPr>
+        <w:pStyle w:val="ListParagraph"/>
+        <w:jc w:val="left"/>
+      </w:pPr>
+      <w:r>
+        <w:rPr/>
+        <w:t xml:space="preserve">Four sites show no activity for a year or more or hold almost no content (AFFINITY GROUP CALCULATORS, Zips and IBG last active in 2024; All Company in December 2025)</w:t>
+      </w:r>
+    </w:p>
+    <w:p>
+      <w:pPr>
+        <w:pStyle w:val="ListParagraph"/>
+        <w:jc w:val="left"/>
+      </w:pPr>
+      <w:r>
+        <w:rPr/>
+        <w:t xml:space="preserve">Storage use is under 1.5% of quota on every site, so capacity is not a constraint</w:t>
+      </w:r>
+    </w:p>
+    <w:p>
+      <w:pPr>
+        <w:pStyle w:val="Heading2"/>
+        <w:keepNext/>
+        <w:spacing w:before="240" w:after="120"/>
+      </w:pPr>
+      <w:r>
+        <w:rPr/>
+        <w:t xml:space="preserve">OneDrive Footprint</w:t>
+      </w:r>
+    </w:p>
+    <w:tbl>
+      <w:tblPr>
+        <w:tblStyle w:val="RicohTableStyle"/>
+        <w:tblW w:w="8929" w:type="dxa"/>
+        <w:tblLayout w:type="fixed"/>
+        <w:tblLook w:val="04A0" w:firstRow="1" w:lastRow="0" w:firstColumn="0" w:lastColumn="0" w:noHBand="0" w:noVBand="1"/>
+      </w:tblPr>
+      <w:tblGrid>
+        <w:gridCol w:w="2600"/>
+        <w:gridCol w:w="1400"/>
+        <w:gridCol w:w="1500"/>
+        <w:gridCol w:w="1900"/>
+        <w:gridCol w:w="1529"/>
+      </w:tblGrid>
+      <w:tr>
+        <w:trPr>
+          <w:cantSplit/>
+          <w:tblHeader/>
+        </w:trPr>
+        <w:tc>
+          <w:tcPr>
+            <w:tcW w:w="2600" w:type="dxa"/>
+          </w:tcPr>
+          <w:p>
+            <w:pPr>
+              <w:spacing w:before="40" w:after="40"/>
+              <w:jc w:val="left"/>
+            </w:pPr>
+            <w:r>
+              <w:rPr>
+                <w:b/>
+                <w:color w:val="FFFFFF"/>
+                <w:sz w:val="20"/>
+                <w:szCs w:val="20"/>
+              </w:rPr>
+              <w:t xml:space="preserve">OneDrive owner</w:t>
+            </w:r>
+          </w:p>
+        </w:tc>
+        <w:tc>
+          <w:tcPr>
+            <w:tcW w:w="1400" w:type="dxa"/>
+          </w:tcPr>
+          <w:p>
+            <w:pPr>
+              <w:spacing w:before="40" w:after="40"/>
+              <w:jc w:val="left"/>
+            </w:pPr>
+            <w:r>
+              <w:rPr>
+                <w:b/>
+                <w:color w:val="FFFFFF"/>
+                <w:sz w:val="20"/>
+                <w:szCs w:val="20"/>
+              </w:rPr>
+              <w:t xml:space="preserve">Files</w:t>
+            </w:r>
+          </w:p>
+        </w:tc>
+        <w:tc>
+          <w:tcPr>
+            <w:tcW w:w="1500" w:type="dxa"/>
+          </w:tcPr>
+          <w:p>
+            <w:pPr>
+              <w:spacing w:before="40" w:after="40"/>
+              <w:jc w:val="left"/>
+            </w:pPr>
+            <w:r>
+              <w:rPr>
+                <w:b/>
+                <w:color w:val="FFFFFF"/>
+                <w:sz w:val="20"/>
+                <w:szCs w:val="20"/>
+              </w:rPr>
+              <w:t xml:space="preserve">Users with access</w:t>
+            </w:r>
+          </w:p>
+        </w:tc>
+        <w:tc>
+          <w:tcPr>
+            <w:tcW w:w="1900" w:type="dxa"/>
+          </w:tcPr>
+          <w:p>
+            <w:pPr>
+              <w:spacing w:before="40" w:after="40"/>
+              <w:jc w:val="left"/>
+            </w:pPr>
+            <w:r>
+              <w:rPr>
+                <w:b/>
+                <w:color w:val="FFFFFF"/>
+                <w:sz w:val="20"/>
+                <w:szCs w:val="20"/>
+              </w:rPr>
+              <w:t xml:space="preserve">Unique-permission items</w:t>
+            </w:r>
+          </w:p>
+        </w:tc>
+        <w:tc>
+          <w:tcPr>
+            <w:tcW w:w="1529" w:type="dxa"/>
+          </w:tcPr>
+          <w:p>
+            <w:pPr>
+              <w:spacing w:before="40" w:after="40"/>
+              <w:jc w:val="left"/>
+            </w:pPr>
+            <w:r>
+              <w:rPr>
+                <w:b/>
+                <w:color w:val="FFFFFF"/>
+                <w:sz w:val="20"/>
+                <w:szCs w:val="20"/>
+              </w:rPr>
+              <w:t xml:space="preserve">"Anyone" links</w:t>
+            </w:r>
+          </w:p>
+        </w:tc>
+      </w:tr>
+      <w:tr>
+        <w:trPr>
+          <w:cantSplit/>
+        </w:trPr>
+        <w:tc>
+          <w:tcPr>
+            <w:tcW w:w="2600" w:type="dxa"/>
+          </w:tcPr>
+          <w:p>
+            <w:pPr>
+              <w:spacing w:before="40" w:after="40"/>
+              <w:jc w:val="left"/>
+            </w:pPr>
+            <w:r>
+              <w:rPr>
+                <w:sz w:val="20"/>
+                <w:szCs w:val="20"/>
+              </w:rPr>
+              <w:t xml:space="preserve">Advice Financial (admin)</w:t>
+            </w:r>
+          </w:p>
+        </w:tc>
+        <w:tc>
+          <w:tcPr>
+            <w:tcW w:w="1400" w:type="dxa"/>
+          </w:tcPr>
+          <w:p>
+            <w:pPr>
+              <w:spacing w:before="40" w:after="40"/>
+              <w:jc w:val="left"/>
+            </w:pPr>
+            <w:r>
+              <w:rPr>
+                <w:sz w:val="20"/>
+                <w:szCs w:val="20"/>
+              </w:rPr>
+              <w:t xml:space="preserve">235,208</w:t>
+            </w:r>
+          </w:p>
+        </w:tc>
+        <w:tc>
+          <w:tcPr>
+            <w:tcW w:w="1500" w:type="dxa"/>
+          </w:tcPr>
+          <w:p>
+            <w:pPr>
+              <w:spacing w:before="40" w:after="40"/>
+              <w:jc w:val="left"/>
+            </w:pPr>
+            <w:r>
+              <w:rPr>
+                <w:sz w:val="20"/>
+                <w:szCs w:val="20"/>
+              </w:rPr>
+              <w:t xml:space="preserve">13</w:t>
+            </w:r>
+          </w:p>
+        </w:tc>
+        <w:tc>
+          <w:tcPr>
+            <w:tcW w:w="1900" w:type="dxa"/>
+          </w:tcPr>
+          <w:p>
+            <w:pPr>
+              <w:spacing w:before="40" w:after="40"/>
+              <w:jc w:val="left"/>
+            </w:pPr>
+            <w:r>
+              <w:rPr>
+                <w:sz w:val="20"/>
+                <w:szCs w:val="20"/>
+              </w:rPr>
+              <w:t xml:space="preserve">170</w:t>
+            </w:r>
+          </w:p>
+        </w:tc>
+        <w:tc>
+          <w:tcPr>
+            <w:tcW w:w="1529" w:type="dxa"/>
+          </w:tcPr>
+          <w:p>
+            <w:pPr>
+              <w:spacing w:before="40" w:after="40"/>
+              <w:jc w:val="left"/>
+            </w:pPr>
+            <w:r>
+              <w:rPr>
+                <w:sz w:val="20"/>
+                <w:szCs w:val="20"/>
+              </w:rPr>
+              <w:t xml:space="preserve">152</w:t>
+            </w:r>
+          </w:p>
+        </w:tc>
+      </w:tr>
+      <w:tr>
+        <w:trPr>
+          <w:cantSplit/>
+        </w:trPr>
+        <w:tc>
+          <w:tcPr>
+            <w:tcW w:w="2600" w:type="dxa"/>
+          </w:tcPr>
+          <w:p>
+            <w:pPr>
+              <w:spacing w:before="40" w:after="40"/>
+              <w:jc w:val="left"/>
+            </w:pPr>
+            <w:r>
+              <w:rPr>
+                <w:sz w:val="20"/>
+                <w:szCs w:val="20"/>
+              </w:rPr>
+              <w:t xml:space="preserve">Jamie Coltman</w:t>
+            </w:r>
+          </w:p>
+        </w:tc>
+        <w:tc>
+          <w:tcPr>
+            <w:tcW w:w="1400" w:type="dxa"/>
+          </w:tcPr>
+          <w:p>
+            <w:pPr>
+              <w:spacing w:before="40" w:after="40"/>
+              <w:jc w:val="left"/>
+            </w:pPr>
+            <w:r>
+              <w:rPr>
+                <w:sz w:val="20"/>
+                <w:szCs w:val="20"/>
+              </w:rPr>
+              <w:t xml:space="preserve">51,989</w:t>
+            </w:r>
+          </w:p>
+        </w:tc>
+        <w:tc>
+          <w:tcPr>
+            <w:tcW w:w="1500" w:type="dxa"/>
+          </w:tcPr>
+          <w:p>
+            <w:pPr>
+              <w:spacing w:before="40" w:after="40"/>
+              <w:jc w:val="left"/>
+            </w:pPr>
+            <w:r>
+              <w:rPr>
+                <w:sz w:val="20"/>
+                <w:szCs w:val="20"/>
+              </w:rPr>
+              <w:t xml:space="preserve">7</w:t>
+            </w:r>
+          </w:p>
+        </w:tc>
+        <w:tc>
+          <w:tcPr>
+            <w:tcW w:w="1900" w:type="dxa"/>
+          </w:tcPr>
+          <w:p>
+            <w:pPr>
+              <w:spacing w:before="40" w:after="40"/>
+              <w:jc w:val="left"/>
+            </w:pPr>
+            <w:r>
+              <w:rPr>
+                <w:sz w:val="20"/>
+                <w:szCs w:val="20"/>
+              </w:rPr>
+              <w:t xml:space="preserve">41</w:t>
+            </w:r>
+          </w:p>
+        </w:tc>
+        <w:tc>
+          <w:tcPr>
+            <w:tcW w:w="1529" w:type="dxa"/>
+          </w:tcPr>
+          <w:p>
+            <w:pPr>
+              <w:spacing w:before="40" w:after="40"/>
+              <w:jc w:val="left"/>
+            </w:pPr>
+            <w:r>
+              <w:rPr>
+                <w:sz w:val="20"/>
+                <w:szCs w:val="20"/>
+              </w:rPr>
+              <w:t xml:space="preserve">27</w:t>
+            </w:r>
+          </w:p>
+        </w:tc>
+      </w:tr>
+      <w:tr>
+        <w:trPr>
+          <w:cantSplit/>
+        </w:trPr>
+        <w:tc>
+          <w:tcPr>
+            <w:tcW w:w="2600" w:type="dxa"/>
+          </w:tcPr>
+          <w:p>
+            <w:pPr>
+              <w:spacing w:before="40" w:after="40"/>
+              <w:jc w:val="left"/>
+            </w:pPr>
+            <w:r>
+              <w:rPr>
+                <w:sz w:val="20"/>
+                <w:szCs w:val="20"/>
+              </w:rPr>
+              <w:t xml:space="preserve">Hamish Coltman</w:t>
+            </w:r>
+          </w:p>
+        </w:tc>
+        <w:tc>
+          <w:tcPr>
+            <w:tcW w:w="1400" w:type="dxa"/>
+          </w:tcPr>
+          <w:p>
+            <w:pPr>
+              <w:spacing w:before="40" w:after="40"/>
+              <w:jc w:val="left"/>
+            </w:pPr>
+            <w:r>
+              <w:rPr>
+                <w:sz w:val="20"/>
+                <w:szCs w:val="20"/>
+              </w:rPr>
+              <w:t xml:space="preserve">12,931</w:t>
+            </w:r>
+          </w:p>
+        </w:tc>
+        <w:tc>
+          <w:tcPr>
+            <w:tcW w:w="1500" w:type="dxa"/>
+          </w:tcPr>
+          <w:p>
+            <w:pPr>
+              <w:spacing w:before="40" w:after="40"/>
+              <w:jc w:val="left"/>
+            </w:pPr>
+            <w:r>
+              <w:rPr>
+                <w:sz w:val="20"/>
+                <w:szCs w:val="20"/>
+              </w:rPr>
+              <w:t xml:space="preserve">10</w:t>
+            </w:r>
+          </w:p>
+        </w:tc>
+        <w:tc>
+          <w:tcPr>
+            <w:tcW w:w="1900" w:type="dxa"/>
+          </w:tcPr>
+          <w:p>
+            <w:pPr>
+              <w:spacing w:before="40" w:after="40"/>
+              <w:jc w:val="left"/>
+            </w:pPr>
+            <w:r>
+              <w:rPr>
+                <w:sz w:val="20"/>
+                <w:szCs w:val="20"/>
+              </w:rPr>
+              <w:t xml:space="preserve">98</w:t>
+            </w:r>
+          </w:p>
+        </w:tc>
+        <w:tc>
+          <w:tcPr>
+            <w:tcW w:w="1529" w:type="dxa"/>
+          </w:tcPr>
+          <w:p>
+            <w:pPr>
+              <w:spacing w:before="40" w:after="40"/>
+              <w:jc w:val="left"/>
+            </w:pPr>
+            <w:r>
+              <w:rPr>
+                <w:sz w:val="20"/>
+                <w:szCs w:val="20"/>
+              </w:rPr>
+              <w:t xml:space="preserve">79</w:t>
+            </w:r>
+          </w:p>
+        </w:tc>
+      </w:tr>
+      <w:tr>
+        <w:trPr>
+          <w:cantSplit/>
+        </w:trPr>
+        <w:tc>
+          <w:tcPr>
+            <w:tcW w:w="2600" w:type="dxa"/>
+          </w:tcPr>
+          <w:p>
+            <w:pPr>
+              <w:spacing w:before="40" w:after="40"/>
+              <w:jc w:val="left"/>
+            </w:pPr>
+            <w:r>
+              <w:rPr>
+                <w:sz w:val="20"/>
+                <w:szCs w:val="20"/>
+              </w:rPr>
+              <w:t xml:space="preserve">Paul Bartlett</w:t>
+            </w:r>
+          </w:p>
+        </w:tc>
+        <w:tc>
+          <w:tcPr>
+            <w:tcW w:w="1400" w:type="dxa"/>
+          </w:tcPr>
+          <w:p>
+            <w:pPr>
+              <w:spacing w:before="40" w:after="40"/>
+              <w:jc w:val="left"/>
+            </w:pPr>
+            <w:r>
+              <w:rPr>
+                <w:sz w:val="20"/>
+                <w:szCs w:val="20"/>
+              </w:rPr>
+              <w:t xml:space="preserve">11,071</w:t>
+            </w:r>
+          </w:p>
+        </w:tc>
+        <w:tc>
+          <w:tcPr>
+            <w:tcW w:w="1500" w:type="dxa"/>
+          </w:tcPr>
+          <w:p>
+            <w:pPr>
+              <w:spacing w:before="40" w:after="40"/>
+              <w:jc w:val="left"/>
+            </w:pPr>
+            <w:r>
+              <w:rPr>
+                <w:sz w:val="20"/>
+                <w:szCs w:val="20"/>
+              </w:rPr>
+              <w:t xml:space="preserve">2</w:t>
+            </w:r>
+          </w:p>
+        </w:tc>
+        <w:tc>
+          <w:tcPr>
+            <w:tcW w:w="1900" w:type="dxa"/>
+          </w:tcPr>
+          <w:p>
+            <w:pPr>
+              <w:spacing w:before="40" w:after="40"/>
+              <w:jc w:val="left"/>
+            </w:pPr>
+            <w:r>
+              <w:rPr>
+                <w:sz w:val="20"/>
+                <w:szCs w:val="20"/>
+              </w:rPr>
+              <w:t xml:space="preserve">14</w:t>
+            </w:r>
+          </w:p>
+        </w:tc>
+        <w:tc>
+          <w:tcPr>
+            <w:tcW w:w="1529" w:type="dxa"/>
+          </w:tcPr>
+          <w:p>
+            <w:pPr>
+              <w:spacing w:before="40" w:after="40"/>
+              <w:jc w:val="left"/>
+            </w:pPr>
+            <w:r>
+              <w:rPr>
+                <w:sz w:val="20"/>
+                <w:szCs w:val="20"/>
+              </w:rPr>
+              <w:t xml:space="preserve">12</w:t>
+            </w:r>
+          </w:p>
+        </w:tc>
+      </w:tr>
+      <w:tr>
+        <w:trPr>
+          <w:cantSplit/>
+        </w:trPr>
+        <w:tc>
+          <w:tcPr>
+            <w:tcW w:w="2600" w:type="dxa"/>
+          </w:tcPr>
+          <w:p>
+            <w:pPr>
+              <w:spacing w:before="40" w:after="40"/>
+              <w:jc w:val="left"/>
+            </w:pPr>
+            <w:r>
+              <w:rPr>
+                <w:sz w:val="20"/>
+                <w:szCs w:val="20"/>
+              </w:rPr>
+              <w:t xml:space="preserve">Jessica Coltman</w:t>
+            </w:r>
+          </w:p>
+        </w:tc>
+        <w:tc>
+          <w:tcPr>
+            <w:tcW w:w="1400" w:type="dxa"/>
+          </w:tcPr>
+          <w:p>
+            <w:pPr>
+              <w:spacing w:before="40" w:after="40"/>
+              <w:jc w:val="left"/>
+            </w:pPr>
+            <w:r>
+              <w:rPr>
+                <w:sz w:val="20"/>
+                <w:szCs w:val="20"/>
+              </w:rPr>
+              <w:t xml:space="preserve">11,536</w:t>
+            </w:r>
+          </w:p>
+        </w:tc>
+        <w:tc>
+          <w:tcPr>
+            <w:tcW w:w="1500" w:type="dxa"/>
+          </w:tcPr>
+          <w:p>
+            <w:pPr>
+              <w:spacing w:before="40" w:after="40"/>
+              <w:jc w:val="left"/>
+            </w:pPr>
+            <w:r>
+              <w:rPr>
+                <w:sz w:val="20"/>
+                <w:szCs w:val="20"/>
+              </w:rPr>
+              <w:t xml:space="preserve">8</w:t>
+            </w:r>
+          </w:p>
+        </w:tc>
+        <w:tc>
+          <w:tcPr>
+            <w:tcW w:w="1900" w:type="dxa"/>
+          </w:tcPr>
+          <w:p>
+            <w:pPr>
+              <w:spacing w:before="40" w:after="40"/>
+              <w:jc w:val="left"/>
+            </w:pPr>
+            <w:r>
+              <w:rPr>
+                <w:sz w:val="20"/>
+                <w:szCs w:val="20"/>
+              </w:rPr>
+              <w:t xml:space="preserve">32</w:t>
+            </w:r>
+          </w:p>
+        </w:tc>
+        <w:tc>
+          <w:tcPr>
+            <w:tcW w:w="1529" w:type="dxa"/>
+          </w:tcPr>
+          <w:p>
+            <w:pPr>
+              <w:spacing w:before="40" w:after="40"/>
+              <w:jc w:val="left"/>
+            </w:pPr>
+            <w:r>
+              <w:rPr>
+                <w:sz w:val="20"/>
+                <w:szCs w:val="20"/>
+              </w:rPr>
+              <w:t xml:space="preserve">27</w:t>
+            </w:r>
+          </w:p>
+        </w:tc>
+      </w:tr>
+      <w:tr>
+        <w:trPr>
+          <w:cantSplit/>
+        </w:trPr>
+        <w:tc>
+          <w:tcPr>
+            <w:tcW w:w="2600" w:type="dxa"/>
+          </w:tcPr>
+          <w:p>
+            <w:pPr>
+              <w:spacing w:before="40" w:after="40"/>
+              <w:jc w:val="left"/>
+            </w:pPr>
+            <w:r>
+              <w:rPr>
+                <w:sz w:val="20"/>
+                <w:szCs w:val="20"/>
+              </w:rPr>
+              <w:t xml:space="preserve">Tom Coltman</w:t>
+            </w:r>
+          </w:p>
+        </w:tc>
+        <w:tc>
+          <w:tcPr>
+            <w:tcW w:w="1400" w:type="dxa"/>
+          </w:tcPr>
+          <w:p>
+            <w:pPr>
+              <w:spacing w:before="40" w:after="40"/>
+              <w:jc w:val="left"/>
+            </w:pPr>
+            <w:r>
+              <w:rPr>
+                <w:sz w:val="20"/>
+                <w:szCs w:val="20"/>
+              </w:rPr>
+              <w:t xml:space="preserve">4,845</w:t>
+            </w:r>
+          </w:p>
+        </w:tc>
+        <w:tc>
+          <w:tcPr>
+            <w:tcW w:w="1500" w:type="dxa"/>
+          </w:tcPr>
+          <w:p>
+            <w:pPr>
+              <w:spacing w:before="40" w:after="40"/>
+              <w:jc w:val="left"/>
+            </w:pPr>
+            <w:r>
+              <w:rPr>
+                <w:sz w:val="20"/>
+                <w:szCs w:val="20"/>
+              </w:rPr>
+              <w:t xml:space="preserve">6</w:t>
+            </w:r>
+          </w:p>
+        </w:tc>
+        <w:tc>
+          <w:tcPr>
+            <w:tcW w:w="1900" w:type="dxa"/>
+          </w:tcPr>
+          <w:p>
+            <w:pPr>
+              <w:spacing w:before="40" w:after="40"/>
+              <w:jc w:val="left"/>
+            </w:pPr>
+            <w:r>
+              <w:rPr>
+                <w:sz w:val="20"/>
+                <w:szCs w:val="20"/>
+              </w:rPr>
+              <w:t xml:space="preserve">47</w:t>
+            </w:r>
+          </w:p>
+        </w:tc>
+        <w:tc>
+          <w:tcPr>
+            <w:tcW w:w="1529" w:type="dxa"/>
+          </w:tcPr>
+          <w:p>
+            <w:pPr>
+              <w:spacing w:before="40" w:after="40"/>
+              <w:jc w:val="left"/>
+            </w:pPr>
+            <w:r>
+              <w:rPr>
+                <w:sz w:val="20"/>
+                <w:szCs w:val="20"/>
+              </w:rPr>
+              <w:t xml:space="preserve">42</w:t>
+            </w:r>
+          </w:p>
+        </w:tc>
+      </w:tr>
+      <w:tr>
+        <w:trPr>
+          <w:cantSplit/>
+        </w:trPr>
+        <w:tc>
+          <w:tcPr>
+            <w:tcW w:w="2600" w:type="dxa"/>
+          </w:tcPr>
+          <w:p>
+            <w:pPr>
+              <w:spacing w:before="40" w:after="40"/>
+              <w:jc w:val="left"/>
+            </w:pPr>
+            <w:r>
+              <w:rPr>
+                <w:sz w:val="20"/>
+                <w:szCs w:val="20"/>
+              </w:rPr>
+              <w:t xml:space="preserve">Marcus Brown</w:t>
+            </w:r>
+          </w:p>
+        </w:tc>
+        <w:tc>
+          <w:tcPr>
+            <w:tcW w:w="1400" w:type="dxa"/>
+          </w:tcPr>
+          <w:p>
+            <w:pPr>
+              <w:spacing w:before="40" w:after="40"/>
+              <w:jc w:val="left"/>
+            </w:pPr>
+            <w:r>
+              <w:rPr>
+                <w:sz w:val="20"/>
+                <w:szCs w:val="20"/>
+              </w:rPr>
+              <w:t xml:space="preserve">3,246</w:t>
+            </w:r>
+          </w:p>
+        </w:tc>
+        <w:tc>
+          <w:tcPr>
+            <w:tcW w:w="1500" w:type="dxa"/>
+          </w:tcPr>
+          <w:p>
+            <w:pPr>
+              <w:spacing w:before="40" w:after="40"/>
+              <w:jc w:val="left"/>
+            </w:pPr>
+            <w:r>
+              <w:rPr>
+                <w:sz w:val="20"/>
+                <w:szCs w:val="20"/>
+              </w:rPr>
+              <w:t xml:space="preserve">6</w:t>
+            </w:r>
+          </w:p>
+        </w:tc>
+        <w:tc>
+          <w:tcPr>
+            <w:tcW w:w="1900" w:type="dxa"/>
+          </w:tcPr>
+          <w:p>
+            <w:pPr>
+              <w:spacing w:before="40" w:after="40"/>
+              <w:jc w:val="left"/>
+            </w:pPr>
+            <w:r>
+              <w:rPr>
+                <w:sz w:val="20"/>
+                <w:szCs w:val="20"/>
+              </w:rPr>
+              <w:t xml:space="preserve">23</w:t>
+            </w:r>
+          </w:p>
+        </w:tc>
+        <w:tc>
+          <w:tcPr>
+            <w:tcW w:w="1529" w:type="dxa"/>
+          </w:tcPr>
+          <w:p>
+            <w:pPr>
+              <w:spacing w:before="40" w:after="40"/>
+              <w:jc w:val="left"/>
+            </w:pPr>
+            <w:r>
+              <w:rPr>
+                <w:sz w:val="20"/>
+                <w:szCs w:val="20"/>
+              </w:rPr>
+              <w:t xml:space="preserve">19</w:t>
+            </w:r>
+          </w:p>
+        </w:tc>
+      </w:tr>
+      <w:tr>
+        <w:trPr>
+          <w:cantSplit/>
+        </w:trPr>
+        <w:tc>
+          <w:tcPr>
+            <w:tcW w:w="2600" w:type="dxa"/>
+          </w:tcPr>
+          <w:p>
+            <w:pPr>
+              <w:spacing w:before="40" w:after="40"/>
+              <w:jc w:val="left"/>
+            </w:pPr>
+            <w:r>
+              <w:rPr>
+                <w:sz w:val="20"/>
+                <w:szCs w:val="20"/>
+              </w:rPr>
+              <w:t xml:space="preserve">George Orton</w:t>
+            </w:r>
+          </w:p>
+        </w:tc>
+        <w:tc>
+          <w:tcPr>
+            <w:tcW w:w="1400" w:type="dxa"/>
+          </w:tcPr>
+          <w:p>
+            <w:pPr>
+              <w:spacing w:before="40" w:after="40"/>
+              <w:jc w:val="left"/>
+            </w:pPr>
+            <w:r>
+              <w:rPr>
+                <w:sz w:val="20"/>
+                <w:szCs w:val="20"/>
+              </w:rPr>
+              <w:t xml:space="preserve">321</w:t>
+            </w:r>
+          </w:p>
+        </w:tc>
+        <w:tc>
+          <w:tcPr>
+            <w:tcW w:w="1500" w:type="dxa"/>
+          </w:tcPr>
+          <w:p>
+            <w:pPr>
+              <w:spacing w:before="40" w:after="40"/>
+              <w:jc w:val="left"/>
+            </w:pPr>
+            <w:r>
+              <w:rPr>
+                <w:sz w:val="20"/>
+                <w:szCs w:val="20"/>
+              </w:rPr>
+              <w:t xml:space="preserve">2</w:t>
+            </w:r>
+          </w:p>
+        </w:tc>
+        <w:tc>
+          <w:tcPr>
+            <w:tcW w:w="1900" w:type="dxa"/>
+          </w:tcPr>
+          <w:p>
+            <w:pPr>
+              <w:spacing w:before="40" w:after="40"/>
+              <w:jc w:val="left"/>
+            </w:pPr>
+            <w:r>
+              <w:rPr>
+                <w:sz w:val="20"/>
+                <w:szCs w:val="20"/>
+              </w:rPr>
+              <w:t xml:space="preserve">3</w:t>
+            </w:r>
+          </w:p>
+        </w:tc>
+        <w:tc>
+          <w:tcPr>
+            <w:tcW w:w="1529" w:type="dxa"/>
+          </w:tcPr>
+          <w:p>
+            <w:pPr>
+              <w:spacing w:before="40" w:after="40"/>
+              <w:jc w:val="left"/>
+            </w:pPr>
+            <w:r>
+              <w:rPr>
+                <w:sz w:val="20"/>
+                <w:szCs w:val="20"/>
+              </w:rPr>
+              <w:t xml:space="preserve">0</w:t>
+            </w:r>
+          </w:p>
+        </w:tc>
+      </w:tr>
+      <w:tr>
+        <w:trPr>
+          <w:cantSplit/>
+        </w:trPr>
+        <w:tc>
+          <w:tcPr>
+            <w:tcW w:w="2600" w:type="dxa"/>
+          </w:tcPr>
+          <w:p>
+            <w:pPr>
+              <w:spacing w:before="40" w:after="40"/>
+              <w:jc w:val="left"/>
+            </w:pPr>
+            <w:r>
+              <w:rPr>
+                <w:sz w:val="20"/>
+                <w:szCs w:val="20"/>
+              </w:rPr>
+              <w:t xml:space="preserve">Irene Mendoza</w:t>
+            </w:r>
+          </w:p>
+        </w:tc>
+        <w:tc>
+          <w:tcPr>
+            <w:tcW w:w="1400" w:type="dxa"/>
+          </w:tcPr>
+          <w:p>
+            <w:pPr>
+              <w:spacing w:before="40" w:after="40"/>
+              <w:jc w:val="left"/>
+            </w:pPr>
+            <w:r>
+              <w:rPr>
+                <w:sz w:val="20"/>
+                <w:szCs w:val="20"/>
+              </w:rPr>
+              <w:t xml:space="preserve">157</w:t>
+            </w:r>
+          </w:p>
+        </w:tc>
+        <w:tc>
+          <w:tcPr>
+            <w:tcW w:w="1500" w:type="dxa"/>
+          </w:tcPr>
+          <w:p>
+            <w:pPr>
+              <w:spacing w:before="40" w:after="40"/>
+              <w:jc w:val="left"/>
+            </w:pPr>
+            <w:r>
+              <w:rPr>
+                <w:sz w:val="20"/>
+                <w:szCs w:val="20"/>
+              </w:rPr>
+              <w:t xml:space="preserve">8</w:t>
+            </w:r>
+          </w:p>
+        </w:tc>
+        <w:tc>
+          <w:tcPr>
+            <w:tcW w:w="1900" w:type="dxa"/>
+          </w:tcPr>
+          <w:p>
+            <w:pPr>
+              <w:spacing w:before="40" w:after="40"/>
+              <w:jc w:val="left"/>
+            </w:pPr>
+            <w:r>
+              <w:rPr>
+                <w:sz w:val="20"/>
+                <w:szCs w:val="20"/>
+              </w:rPr>
+              <w:t xml:space="preserve">130</w:t>
+            </w:r>
+          </w:p>
+        </w:tc>
+        <w:tc>
+          <w:tcPr>
+            <w:tcW w:w="1529" w:type="dxa"/>
+          </w:tcPr>
+          <w:p>
+            <w:pPr>
+              <w:spacing w:before="40" w:after="40"/>
+              <w:jc w:val="left"/>
+            </w:pPr>
+            <w:r>
+              <w:rPr>
+                <w:sz w:val="20"/>
+                <w:szCs w:val="20"/>
+              </w:rPr>
+              <w:t xml:space="preserve">127</w:t>
+            </w:r>
+          </w:p>
+        </w:tc>
+      </w:tr>
+      <w:tr>
+        <w:trPr>
+          <w:cantSplit/>
+        </w:trPr>
+        <w:tc>
+          <w:tcPr>
+            <w:tcW w:w="2600" w:type="dxa"/>
+          </w:tcPr>
+          <w:p>
+            <w:pPr>
+              <w:spacing w:before="40" w:after="40"/>
+              <w:jc w:val="left"/>
+            </w:pPr>
+            <w:r>
+              <w:rPr>
+                <w:sz w:val="20"/>
+                <w:szCs w:val="20"/>
+              </w:rPr>
+              <w:t xml:space="preserve">Sharrah Tracy</w:t>
+            </w:r>
+          </w:p>
+        </w:tc>
+        <w:tc>
+          <w:tcPr>
+            <w:tcW w:w="1400" w:type="dxa"/>
+          </w:tcPr>
+          <w:p>
+            <w:pPr>
+              <w:spacing w:before="40" w:after="40"/>
+              <w:jc w:val="left"/>
+            </w:pPr>
+            <w:r>
+              <w:rPr>
+                <w:sz w:val="20"/>
+                <w:szCs w:val="20"/>
+              </w:rPr>
+              <w:t xml:space="preserve">13</w:t>
+            </w:r>
+          </w:p>
+        </w:tc>
+        <w:tc>
+          <w:tcPr>
+            <w:tcW w:w="1500" w:type="dxa"/>
+          </w:tcPr>
+          <w:p>
+            <w:pPr>
+              <w:spacing w:before="40" w:after="40"/>
+              <w:jc w:val="left"/>
+            </w:pPr>
+            <w:r>
+              <w:rPr>
+                <w:sz w:val="20"/>
+                <w:szCs w:val="20"/>
+              </w:rPr>
+              <w:t xml:space="preserve">3</w:t>
+            </w:r>
+          </w:p>
+        </w:tc>
+        <w:tc>
+          <w:tcPr>
+            <w:tcW w:w="1900" w:type="dxa"/>
+          </w:tcPr>
+          <w:p>
+            <w:pPr>
+              <w:spacing w:before="40" w:after="40"/>
+              <w:jc w:val="left"/>
+            </w:pPr>
+            <w:r>
+              <w:rPr>
+                <w:sz w:val="20"/>
+                <w:szCs w:val="20"/>
+              </w:rPr>
+              <w:t xml:space="preserve">7</w:t>
+            </w:r>
+          </w:p>
+        </w:tc>
+        <w:tc>
+          <w:tcPr>
+            <w:tcW w:w="1529" w:type="dxa"/>
+          </w:tcPr>
+          <w:p>
+            <w:pPr>
+              <w:spacing w:before="40" w:after="40"/>
+              <w:jc w:val="left"/>
+            </w:pPr>
+            <w:r>
+              <w:rPr>
+                <w:sz w:val="20"/>
+                <w:szCs w:val="20"/>
+              </w:rPr>
+              <w:t xml:space="preserve">4</w:t>
+            </w:r>
+          </w:p>
+        </w:tc>
+      </w:tr>
+      <w:tr>
+        <w:trPr>
+          <w:cantSplit/>
+        </w:trPr>
+        <w:tc>
+          <w:tcPr>
+            <w:tcW w:w="2600" w:type="dxa"/>
+          </w:tcPr>
+          <w:p>
+            <w:pPr>
+              <w:spacing w:before="40" w:after="40"/>
+              <w:jc w:val="left"/>
+            </w:pPr>
+            <w:r>
+              <w:rPr>
+                <w:sz w:val="20"/>
+                <w:szCs w:val="20"/>
+              </w:rPr>
+              <w:t xml:space="preserve">John Bell</w:t>
+            </w:r>
+          </w:p>
+        </w:tc>
+        <w:tc>
+          <w:tcPr>
+            <w:tcW w:w="1400" w:type="dxa"/>
+          </w:tcPr>
+          <w:p>
+            <w:pPr>
+              <w:spacing w:before="40" w:after="40"/>
+              <w:jc w:val="left"/>
+            </w:pPr>
+            <w:r>
+              <w:rPr>
+                <w:sz w:val="20"/>
+                <w:szCs w:val="20"/>
+              </w:rPr>
+              <w:t xml:space="preserve">1</w:t>
+            </w:r>
+          </w:p>
+        </w:tc>
+        <w:tc>
+          <w:tcPr>
+            <w:tcW w:w="1500" w:type="dxa"/>
+          </w:tcPr>
+          <w:p>
+            <w:pPr>
+              <w:spacing w:before="40" w:after="40"/>
+              <w:jc w:val="left"/>
+            </w:pPr>
+            <w:r>
+              <w:rPr>
+                <w:sz w:val="20"/>
+                <w:szCs w:val="20"/>
+              </w:rPr>
+              <w:t xml:space="preserve">1</w:t>
+            </w:r>
+          </w:p>
+        </w:tc>
+        <w:tc>
+          <w:tcPr>
+            <w:tcW w:w="1900" w:type="dxa"/>
+          </w:tcPr>
+          <w:p>
+            <w:pPr>
+              <w:spacing w:before="40" w:after="40"/>
+              <w:jc w:val="left"/>
+            </w:pPr>
+            <w:r>
+              <w:rPr>
+                <w:sz w:val="20"/>
+                <w:szCs w:val="20"/>
+              </w:rPr>
+              <w:t xml:space="preserve">0</w:t>
+            </w:r>
+          </w:p>
+        </w:tc>
+        <w:tc>
+          <w:tcPr>
+            <w:tcW w:w="1529" w:type="dxa"/>
+          </w:tcPr>
+          <w:p>
+            <w:pPr>
+              <w:spacing w:before="40" w:after="40"/>
+              <w:jc w:val="left"/>
+            </w:pPr>
+            <w:r>
+              <w:rPr>
+                <w:sz w:val="20"/>
+                <w:szCs w:val="20"/>
+              </w:rPr>
+              <w:t xml:space="preserve">0</w:t>
+            </w:r>
+          </w:p>
+        </w:tc>
+      </w:tr>
+      <w:tr>
+        <w:trPr>
+          <w:cantSplit/>
+        </w:trPr>
+        <w:tc>
+          <w:tcPr>
+            <w:tcW w:w="2600" w:type="dxa"/>
+          </w:tcPr>
+          <w:p>
+            <w:pPr>
+              <w:spacing w:before="40" w:after="40"/>
+              <w:jc w:val="left"/>
+            </w:pPr>
+            <w:r>
+              <w:rPr>
+                <w:sz w:val="20"/>
+                <w:szCs w:val="20"/>
+              </w:rPr>
+              <w:t xml:space="preserve">Total (11 accounts)</w:t>
+            </w:r>
+          </w:p>
+        </w:tc>
+        <w:tc>
+          <w:tcPr>
+            <w:tcW w:w="1400" w:type="dxa"/>
+          </w:tcPr>
+          <w:p>
+            <w:pPr>
+              <w:spacing w:before="40" w:after="40"/>
+              <w:jc w:val="left"/>
+            </w:pPr>
+            <w:r>
+              <w:rPr>
+                <w:sz w:val="20"/>
+                <w:szCs w:val="20"/>
+              </w:rPr>
+              <w:t xml:space="preserve">331,318</w:t>
+            </w:r>
+          </w:p>
+        </w:tc>
+        <w:tc>
+          <w:tcPr>
+            <w:tcW w:w="1500" w:type="dxa"/>
+          </w:tcPr>
+          <w:p>
+            <w:pPr>
+              <w:spacing w:before="40" w:after="40"/>
+              <w:jc w:val="left"/>
+            </w:pPr>
+            <w:r>
+              <w:rPr>
+                <w:sz w:val="20"/>
+                <w:szCs w:val="20"/>
+              </w:rPr>
+              <w:t xml:space="preserve">66</w:t>
+            </w:r>
+          </w:p>
+        </w:tc>
+        <w:tc>
+          <w:tcPr>
+            <w:tcW w:w="1900" w:type="dxa"/>
+          </w:tcPr>
+          <w:p>
+            <w:pPr>
+              <w:spacing w:before="40" w:after="40"/>
+              <w:jc w:val="left"/>
+            </w:pPr>
+            <w:r>
+              <w:rPr>
+                <w:sz w:val="20"/>
+                <w:szCs w:val="20"/>
+              </w:rPr>
+              <w:t xml:space="preserve">565</w:t>
+            </w:r>
+          </w:p>
+        </w:tc>
+        <w:tc>
+          <w:tcPr>
+            <w:tcW w:w="1529" w:type="dxa"/>
+          </w:tcPr>
+          <w:p>
+            <w:pPr>
+              <w:spacing w:before="40" w:after="40"/>
+              <w:jc w:val="left"/>
+            </w:pPr>
+            <w:r>
+              <w:rPr>
+                <w:sz w:val="20"/>
+                <w:szCs w:val="20"/>
+              </w:rPr>
+              <w:t xml:space="preserve">489</w:t>
+            </w:r>
+          </w:p>
+        </w:tc>
+      </w:tr>
+    </w:tbl>
+    <w:p>
+      <w:pPr>
+        <w:spacing w:after="120"/>
+      </w:pPr>
     </w:p>
     <w:p>
       <w:pPr>
@@ -1344,8 +3759,8 @@
       <w:r>
         <w:drawing>
           <wp:inline distT="0" distB="0" distL="0" distR="0">
-            <wp:extent cx="5040000" cy="1749041"/>
-            <wp:docPr id="104" name="heatmap.png" descr="Executive risk heat map"/>
+            <wp:extent cx="5040000" cy="2355875"/>
+            <wp:docPr id="104" name="onedrive.png" descr="Anyone links per OneDrive"/>
             <wp:cNvGraphicFramePr>
               <a:graphicFrameLocks xmlns:a="http://schemas.openxmlformats.org/drawingml/2006/main" noChangeAspect="1"/>
             </wp:cNvGraphicFramePr>
@@ -1353,11 +3768,93 @@
               <a:graphicData uri="http://schemas.openxmlformats.org/drawingml/2006/picture">
                 <pic:pic xmlns:pic="http://schemas.openxmlformats.org/drawingml/2006/picture">
                   <pic:nvPicPr>
-                    <pic:cNvPr id="104" name="heatmap.png"/>
+                    <pic:cNvPr id="104" name="onedrive.png"/>
                     <pic:cNvPicPr/>
                   </pic:nvPicPr>
                   <pic:blipFill>
                     <a:blip r:embed="rIdImg104"/>
+                    <a:stretch>
+                      <a:fillRect/>
+                    </a:stretch>
+                  </pic:blipFill>
+                  <pic:spPr>
+                    <a:xfrm>
+                      <a:off x="0" y="0"/>
+                      <a:ext cx="5040000" cy="2355875"/>
+                    </a:xfrm>
+                    <a:prstGeom prst="rect">
+                      <a:avLst/>
+                    </a:prstGeom>
+                  </pic:spPr>
+                </pic:pic>
+              </a:graphicData>
+            </a:graphic>
+          </wp:inline>
+        </w:drawing>
+      </w:r>
+    </w:p>
+    <w:p>
+      <w:pPr>
+        <w:spacing w:before="60" w:after="200"/>
+        <w:jc w:val="center"/>
+      </w:pPr>
+      <w:r>
+        <w:rPr>
+          <w:i/>
+          <w:color w:val="7F7F7F"/>
+          <w:sz w:val="16"/>
+          <w:szCs w:val="16"/>
+        </w:rPr>
+        <w:t xml:space="preserve">Figure 3: "Anyone" links per OneDrive (source: Permissioned Users Count OneDrive report, 14 Oct 2026)</w:t>
+      </w:r>
+    </w:p>
+    <w:p>
+      <w:pPr>
+        <w:pStyle w:val="Heading1"/>
+        <w:pageBreakBefore/>
+        <w:pBdr>
+          <w:bottom w:val="single" w:sz="18" w:space="4" w:color="E60012"/>
+        </w:pBdr>
+      </w:pPr>
+      <w:r>
+        <w:rPr/>
+        <w:t xml:space="preserve">Section 2: Risk Assessment</w:t>
+      </w:r>
+    </w:p>
+    <w:p>
+      <w:pPr>
+        <w:pStyle w:val="Heading2"/>
+        <w:keepNext/>
+        <w:spacing w:before="240" w:after="120"/>
+      </w:pPr>
+      <w:r>
+        <w:rPr/>
+        <w:t xml:space="preserve">Information Risk Overview</w:t>
+      </w:r>
+    </w:p>
+    <w:p>
+      <w:pPr>
+        <w:keepNext/>
+        <w:spacing w:before="120" w:after="60"/>
+        <w:jc w:val="center"/>
+      </w:pPr>
+      <w:r>
+        <w:drawing>
+          <wp:inline distT="0" distB="0" distL="0" distR="0">
+            <wp:extent cx="5040000" cy="1749041"/>
+            <wp:docPr id="105" name="heatmap.png" descr="Executive risk heat map"/>
+            <wp:cNvGraphicFramePr>
+              <a:graphicFrameLocks xmlns:a="http://schemas.openxmlformats.org/drawingml/2006/main" noChangeAspect="1"/>
+            </wp:cNvGraphicFramePr>
+            <a:graphic xmlns:a="http://schemas.openxmlformats.org/drawingml/2006/main">
+              <a:graphicData uri="http://schemas.openxmlformats.org/drawingml/2006/picture">
+                <pic:pic xmlns:pic="http://schemas.openxmlformats.org/drawingml/2006/picture">
+                  <pic:nvPicPr>
+                    <pic:cNvPr id="105" name="heatmap.png"/>
+                    <pic:cNvPicPr/>
+                  </pic:nvPicPr>
+                  <pic:blipFill>
+                    <a:blip r:embed="rIdImg105"/>
                     <a:stretch>
                       <a:fillRect/>
                     </a:stretch>
@@ -1390,7 +3887,7 @@
           <w:sz w:val="16"/>
           <w:szCs w:val="16"/>
         </w:rPr>
-        <w:t xml:space="preserve">Figure 3: Executive heat map</w:t>
+        <w:t xml:space="preserve">Figure 4: Executive heat map</w:t>
       </w:r>
     </w:p>
     <w:tbl>
@@ -1843,6 +4340,137 @@
         <w:t xml:space="preserve">Permissions Exposure</w:t>
       </w:r>
     </w:p>
+    <w:tbl>
+      <w:tblPr>
+        <w:tblW w:w="8928" w:type="dxa"/>
+        <w:tblBorders>
+          <w:top w:val="single" w:sz="24" w:space="0" w:color="FFFFFF"/>
+          <w:left w:val="single" w:sz="24" w:space="0" w:color="FFFFFF"/>
+          <w:bottom w:val="single" w:sz="24" w:space="0" w:color="FFFFFF"/>
+          <w:right w:val="single" w:sz="24" w:space="0" w:color="FFFFFF"/>
+          <w:insideH w:val="single" w:sz="24" w:space="0" w:color="FFFFFF"/>
+          <w:insideV w:val="single" w:sz="24" w:space="0" w:color="FFFFFF"/>
+        </w:tblBorders>
+        <w:tblLayout w:type="fixed"/>
+      </w:tblPr>
+      <w:tblGrid>
+        <w:gridCol w:w="2976"/>
+        <w:gridCol w:w="2976"/>
+        <w:gridCol w:w="2976"/>
+      </w:tblGrid>
+      <w:tr>
+        <w:tc>
+          <w:tcPr>
+            <w:tcW w:w="2976" w:type="dxa"/>
+            <w:shd w:val="clear" w:color="auto" w:fill="F4F4F4"/>
+          </w:tcPr>
+          <w:p>
+            <w:pPr>
+              <w:spacing w:before="120" w:after="0"/>
+              <w:jc w:val="center"/>
+            </w:pPr>
+            <w:r>
+              <w:rPr>
+                <w:b/>
+                <w:color w:val="E60012"/>
+                <w:sz w:val="44"/>
+                <w:szCs w:val="44"/>
+              </w:rPr>
+              <w:t xml:space="preserve">280</w:t>
+            </w:r>
+          </w:p>
+          <w:p>
+            <w:pPr>
+              <w:spacing w:before="0" w:after="120"/>
+              <w:jc w:val="center"/>
+            </w:pPr>
+            <w:r>
+              <w:rPr>
+                <w:color w:val="333333"/>
+                <w:sz w:val="18"/>
+                <w:szCs w:val="18"/>
+              </w:rPr>
+              <w:t xml:space="preserve">items shared with Everyone except external users</w:t>
+            </w:r>
+          </w:p>
+        </w:tc>
+        <w:tc>
+          <w:tcPr>
+            <w:tcW w:w="2976" w:type="dxa"/>
+            <w:shd w:val="clear" w:color="auto" w:fill="F4F4F4"/>
+          </w:tcPr>
+          <w:p>
+            <w:pPr>
+              <w:spacing w:before="120" w:after="0"/>
+              <w:jc w:val="center"/>
+            </w:pPr>
+            <w:r>
+              <w:rPr>
+                <w:b/>
+                <w:color w:val="E60012"/>
+                <w:sz w:val="44"/>
+                <w:szCs w:val="44"/>
+              </w:rPr>
+              <w:t xml:space="preserve">263</w:t>
+            </w:r>
+          </w:p>
+          <w:p>
+            <w:pPr>
+              <w:spacing w:before="0" w:after="120"/>
+              <w:jc w:val="center"/>
+            </w:pPr>
+            <w:r>
+              <w:rPr>
+                <w:color w:val="333333"/>
+                <w:sz w:val="18"/>
+                <w:szCs w:val="18"/>
+              </w:rPr>
+              <w:t xml:space="preserve">in AF Client Portal</w:t>
+            </w:r>
+          </w:p>
+        </w:tc>
+        <w:tc>
+          <w:tcPr>
+            <w:tcW w:w="2976" w:type="dxa"/>
+            <w:shd w:val="clear" w:color="auto" w:fill="F4F4F4"/>
+          </w:tcPr>
+          <w:p>
+            <w:pPr>
+              <w:spacing w:before="120" w:after="0"/>
+              <w:jc w:val="center"/>
+            </w:pPr>
+            <w:r>
+              <w:rPr>
+                <w:b/>
+                <w:color w:val="E60012"/>
+                <w:sz w:val="44"/>
+                <w:szCs w:val="44"/>
+              </w:rPr>
+              <w:t xml:space="preserve">270</w:t>
+            </w:r>
+          </w:p>
+          <w:p>
+            <w:pPr>
+              <w:spacing w:before="0" w:after="120"/>
+              <w:jc w:val="center"/>
+            </w:pPr>
+            <w:r>
+              <w:rPr>
+                <w:color w:val="333333"/>
+                <w:sz w:val="18"/>
+                <w:szCs w:val="18"/>
+              </w:rPr>
+              <w:t xml:space="preserve">granted Edit rights</w:t>
+            </w:r>
+          </w:p>
+        </w:tc>
+      </w:tr>
+    </w:tbl>
+    <w:p>
+      <w:pPr>
+        <w:spacing w:after="120"/>
+      </w:pPr>
+    </w:p>
     <w:p>
       <w:pPr>
         <w:keepNext/>
@@ -1852,8 +4480,8 @@
       <w:r>
         <w:drawing>
           <wp:inline distT="0" distB="0" distL="0" distR="0">
-            <wp:extent cx="3960000" cy="2673630"/>
-            <wp:docPr id="105" name="donut.png" descr="Donut chart: content shared broadly"/>
+            <wp:extent cx="3960000" cy="2347213"/>
+            <wp:docPr id="106" name="donut.png" descr="Donut chart: content shared broadly"/>
             <wp:cNvGraphicFramePr>
               <a:graphicFrameLocks xmlns:a="http://schemas.openxmlformats.org/drawingml/2006/main" noChangeAspect="1"/>
             </wp:cNvGraphicFramePr>
@@ -1861,11 +4489,11 @@
               <a:graphicData uri="http://schemas.openxmlformats.org/drawingml/2006/picture">
                 <pic:pic xmlns:pic="http://schemas.openxmlformats.org/drawingml/2006/picture">
                   <pic:nvPicPr>
-                    <pic:cNvPr id="105" name="donut.png"/>
+                    <pic:cNvPr id="106" name="donut.png"/>
                     <pic:cNvPicPr/>
                   </pic:nvPicPr>
                   <pic:blipFill>
-                    <a:blip r:embed="rIdImg105"/>
+                    <a:blip r:embed="rIdImg106"/>
                     <a:stretch>
                       <a:fillRect/>
                     </a:stretch>
@@ -1873,7 +4501,7 @@
                   <pic:spPr>
                     <a:xfrm>
                       <a:off x="0" y="0"/>
-                      <a:ext cx="3960000" cy="2673630"/>
+                      <a:ext cx="3960000" cy="2347213"/>
                     </a:xfrm>
                     <a:prstGeom prst="rect">
                       <a:avLst/>
@@ -1898,7 +4526,7 @@
           <w:sz w:val="16"/>
           <w:szCs w:val="16"/>
         </w:rPr>
-        <w:t xml:space="preserve">Figure 4: Content shared broadly. Segments are illustrative; size them from the "Everyone Except External Users" and "Everyone" sharing reports.</w:t>
+        <w:t xml:space="preserve">Figure 5: Items shared with Everyone except external users, by location (source: EEEU report, 14 Oct 2026)</w:t>
       </w:r>
     </w:p>
     <w:p>
@@ -1909,6 +4537,426 @@
       <w:r>
         <w:rPr/>
         <w:t xml:space="preserve">Multiple client documents and folders were identified with "Everyone Except External Users" permissions, increasing exposure of sensitive client information across the organisation.</w:t>
+      </w:r>
+    </w:p>
+    <w:p>
+      <w:pPr>
+        <w:pStyle w:val="Heading3"/>
+        <w:keepNext/>
+      </w:pPr>
+      <w:r>
+        <w:rPr/>
+        <w:t xml:space="preserve">What the sharing reports show</w:t>
+      </w:r>
+    </w:p>
+    <w:tbl>
+      <w:tblPr>
+        <w:tblStyle w:val="RicohTableStyle"/>
+        <w:tblW w:w="8929" w:type="dxa"/>
+        <w:tblLayout w:type="fixed"/>
+        <w:tblLook w:val="04A0" w:firstRow="1" w:lastRow="0" w:firstColumn="0" w:lastColumn="0" w:noHBand="0" w:noVBand="1"/>
+      </w:tblPr>
+      <w:tblGrid>
+        <w:gridCol w:w="7000"/>
+        <w:gridCol w:w="1929"/>
+      </w:tblGrid>
+      <w:tr>
+        <w:trPr>
+          <w:cantSplit/>
+          <w:tblHeader/>
+        </w:trPr>
+        <w:tc>
+          <w:tcPr>
+            <w:tcW w:w="7000" w:type="dxa"/>
+          </w:tcPr>
+          <w:p>
+            <w:pPr>
+              <w:spacing w:before="40" w:after="40"/>
+              <w:jc w:val="left"/>
+            </w:pPr>
+            <w:r>
+              <w:rPr>
+                <w:b/>
+                <w:color w:val="FFFFFF"/>
+                <w:sz w:val="20"/>
+                <w:szCs w:val="20"/>
+              </w:rPr>
+              <w:t xml:space="preserve">Location of shared item</w:t>
+            </w:r>
+          </w:p>
+        </w:tc>
+        <w:tc>
+          <w:tcPr>
+            <w:tcW w:w="1929" w:type="dxa"/>
+          </w:tcPr>
+          <w:p>
+            <w:pPr>
+              <w:spacing w:before="40" w:after="40"/>
+              <w:jc w:val="left"/>
+            </w:pPr>
+            <w:r>
+              <w:rPr>
+                <w:b/>
+                <w:color w:val="FFFFFF"/>
+                <w:sz w:val="20"/>
+                <w:szCs w:val="20"/>
+              </w:rPr>
+              <w:t xml:space="preserve">Items</w:t>
+            </w:r>
+          </w:p>
+        </w:tc>
+      </w:tr>
+      <w:tr>
+        <w:trPr>
+          <w:cantSplit/>
+        </w:trPr>
+        <w:tc>
+          <w:tcPr>
+            <w:tcW w:w="7000" w:type="dxa"/>
+          </w:tcPr>
+          <w:p>
+            <w:pPr>
+              <w:spacing w:before="40" w:after="40"/>
+              <w:jc w:val="left"/>
+            </w:pPr>
+            <w:r>
+              <w:rPr>
+                <w:sz w:val="20"/>
+                <w:szCs w:val="20"/>
+              </w:rPr>
+              <w:t xml:space="preserve">Client Records: Personal Clients folders (190 client folders)</w:t>
+            </w:r>
+          </w:p>
+        </w:tc>
+        <w:tc>
+          <w:tcPr>
+            <w:tcW w:w="1929" w:type="dxa"/>
+          </w:tcPr>
+          <w:p>
+            <w:pPr>
+              <w:spacing w:before="40" w:after="40"/>
+              <w:jc w:val="left"/>
+            </w:pPr>
+            <w:r>
+              <w:rPr>
+                <w:sz w:val="20"/>
+                <w:szCs w:val="20"/>
+              </w:rPr>
+              <w:t xml:space="preserve">203</w:t>
+            </w:r>
+          </w:p>
+        </w:tc>
+      </w:tr>
+      <w:tr>
+        <w:trPr>
+          <w:cantSplit/>
+        </w:trPr>
+        <w:tc>
+          <w:tcPr>
+            <w:tcW w:w="7000" w:type="dxa"/>
+          </w:tcPr>
+          <w:p>
+            <w:pPr>
+              <w:spacing w:before="40" w:after="40"/>
+              <w:jc w:val="left"/>
+            </w:pPr>
+            <w:r>
+              <w:rPr>
+                <w:sz w:val="20"/>
+                <w:szCs w:val="20"/>
+              </w:rPr>
+              <w:t xml:space="preserve">Client Records: Out Of Force - Inactive (40 former clients)</w:t>
+            </w:r>
+          </w:p>
+        </w:tc>
+        <w:tc>
+          <w:tcPr>
+            <w:tcW w:w="1929" w:type="dxa"/>
+          </w:tcPr>
+          <w:p>
+            <w:pPr>
+              <w:spacing w:before="40" w:after="40"/>
+              <w:jc w:val="left"/>
+            </w:pPr>
+            <w:r>
+              <w:rPr>
+                <w:sz w:val="20"/>
+                <w:szCs w:val="20"/>
+              </w:rPr>
+              <w:t xml:space="preserve">40</w:t>
+            </w:r>
+          </w:p>
+        </w:tc>
+      </w:tr>
+      <w:tr>
+        <w:trPr>
+          <w:cantSplit/>
+        </w:trPr>
+        <w:tc>
+          <w:tcPr>
+            <w:tcW w:w="7000" w:type="dxa"/>
+          </w:tcPr>
+          <w:p>
+            <w:pPr>
+              <w:spacing w:before="40" w:after="40"/>
+              <w:jc w:val="left"/>
+            </w:pPr>
+            <w:r>
+              <w:rPr>
+                <w:sz w:val="20"/>
+                <w:szCs w:val="20"/>
+              </w:rPr>
+              <w:t xml:space="preserve">Client Records: Standalone Company and other business client folders</w:t>
+            </w:r>
+          </w:p>
+        </w:tc>
+        <w:tc>
+          <w:tcPr>
+            <w:tcW w:w="1929" w:type="dxa"/>
+          </w:tcPr>
+          <w:p>
+            <w:pPr>
+              <w:spacing w:before="40" w:after="40"/>
+              <w:jc w:val="left"/>
+            </w:pPr>
+            <w:r>
+              <w:rPr>
+                <w:sz w:val="20"/>
+                <w:szCs w:val="20"/>
+              </w:rPr>
+              <w:t xml:space="preserve">18</w:t>
+            </w:r>
+          </w:p>
+        </w:tc>
+      </w:tr>
+      <w:tr>
+        <w:trPr>
+          <w:cantSplit/>
+        </w:trPr>
+        <w:tc>
+          <w:tcPr>
+            <w:tcW w:w="7000" w:type="dxa"/>
+          </w:tcPr>
+          <w:p>
+            <w:pPr>
+              <w:spacing w:before="40" w:after="40"/>
+              <w:jc w:val="left"/>
+            </w:pPr>
+            <w:r>
+              <w:rPr>
+                <w:sz w:val="20"/>
+                <w:szCs w:val="20"/>
+              </w:rPr>
+              <w:t xml:space="preserve">Shared libraries (AF Client Portal library and site level)</w:t>
+            </w:r>
+          </w:p>
+        </w:tc>
+        <w:tc>
+          <w:tcPr>
+            <w:tcW w:w="1929" w:type="dxa"/>
+          </w:tcPr>
+          <w:p>
+            <w:pPr>
+              <w:spacing w:before="40" w:after="40"/>
+              <w:jc w:val="left"/>
+            </w:pPr>
+            <w:r>
+              <w:rPr>
+                <w:sz w:val="20"/>
+                <w:szCs w:val="20"/>
+              </w:rPr>
+              <w:t xml:space="preserve">2</w:t>
+            </w:r>
+          </w:p>
+        </w:tc>
+      </w:tr>
+      <w:tr>
+        <w:trPr>
+          <w:cantSplit/>
+        </w:trPr>
+        <w:tc>
+          <w:tcPr>
+            <w:tcW w:w="7000" w:type="dxa"/>
+          </w:tcPr>
+          <w:p>
+            <w:pPr>
+              <w:spacing w:before="40" w:after="40"/>
+              <w:jc w:val="left"/>
+            </w:pPr>
+            <w:r>
+              <w:rPr>
+                <w:sz w:val="20"/>
+                <w:szCs w:val="20"/>
+              </w:rPr>
+              <w:t xml:space="preserve">Team sites and portals (Team Site, All Company, search and portal webs)</w:t>
+            </w:r>
+          </w:p>
+        </w:tc>
+        <w:tc>
+          <w:tcPr>
+            <w:tcW w:w="1929" w:type="dxa"/>
+          </w:tcPr>
+          <w:p>
+            <w:pPr>
+              <w:spacing w:before="40" w:after="40"/>
+              <w:jc w:val="left"/>
+            </w:pPr>
+            <w:r>
+              <w:rPr>
+                <w:sz w:val="20"/>
+                <w:szCs w:val="20"/>
+              </w:rPr>
+              <w:t xml:space="preserve">14</w:t>
+            </w:r>
+          </w:p>
+        </w:tc>
+      </w:tr>
+      <w:tr>
+        <w:trPr>
+          <w:cantSplit/>
+        </w:trPr>
+        <w:tc>
+          <w:tcPr>
+            <w:tcW w:w="7000" w:type="dxa"/>
+          </w:tcPr>
+          <w:p>
+            <w:pPr>
+              <w:spacing w:before="40" w:after="40"/>
+              <w:jc w:val="left"/>
+            </w:pPr>
+            <w:r>
+              <w:rPr>
+                <w:sz w:val="20"/>
+                <w:szCs w:val="20"/>
+              </w:rPr>
+              <w:t xml:space="preserve">OneDrive (two "Shared with Everyone" folders and one feed list)</w:t>
+            </w:r>
+          </w:p>
+        </w:tc>
+        <w:tc>
+          <w:tcPr>
+            <w:tcW w:w="1929" w:type="dxa"/>
+          </w:tcPr>
+          <w:p>
+            <w:pPr>
+              <w:spacing w:before="40" w:after="40"/>
+              <w:jc w:val="left"/>
+            </w:pPr>
+            <w:r>
+              <w:rPr>
+                <w:sz w:val="20"/>
+                <w:szCs w:val="20"/>
+              </w:rPr>
+              <w:t xml:space="preserve">3</w:t>
+            </w:r>
+          </w:p>
+        </w:tc>
+      </w:tr>
+      <w:tr>
+        <w:trPr>
+          <w:cantSplit/>
+        </w:trPr>
+        <w:tc>
+          <w:tcPr>
+            <w:tcW w:w="7000" w:type="dxa"/>
+          </w:tcPr>
+          <w:p>
+            <w:pPr>
+              <w:spacing w:before="40" w:after="40"/>
+              <w:jc w:val="left"/>
+            </w:pPr>
+            <w:r>
+              <w:rPr>
+                <w:sz w:val="20"/>
+                <w:szCs w:val="20"/>
+              </w:rPr>
+              <w:t xml:space="preserve">Total</w:t>
+            </w:r>
+          </w:p>
+        </w:tc>
+        <w:tc>
+          <w:tcPr>
+            <w:tcW w:w="1929" w:type="dxa"/>
+          </w:tcPr>
+          <w:p>
+            <w:pPr>
+              <w:spacing w:before="40" w:after="40"/>
+              <w:jc w:val="left"/>
+            </w:pPr>
+            <w:r>
+              <w:rPr>
+                <w:sz w:val="20"/>
+                <w:szCs w:val="20"/>
+              </w:rPr>
+              <w:t xml:space="preserve">280</w:t>
+            </w:r>
+          </w:p>
+        </w:tc>
+      </w:tr>
+    </w:tbl>
+    <w:p>
+      <w:pPr>
+        <w:spacing w:after="120"/>
+      </w:pPr>
+    </w:p>
+    <w:p>
+      <w:pPr>
+        <w:pStyle w:val="ListParagraph"/>
+        <w:jc w:val="left"/>
+      </w:pPr>
+      <w:r>
+        <w:rPr/>
+        <w:t xml:space="preserve">The 280 entries are 256 files, 12 folders, 9 webs and 3 lists; 238 of the files are PDFs, and fact-find documents appear throughout the client folders</w:t>
+      </w:r>
+    </w:p>
+    <w:p>
+      <w:pPr>
+        <w:pStyle w:val="ListParagraph"/>
+        <w:jc w:val="left"/>
+      </w:pPr>
+      <w:r>
+        <w:rPr/>
+        <w:t xml:space="preserve">All 263 AF Client Portal entries are granted through the "AF Client Portal Members" SharePoint group, which resolves to 8 users</w:t>
+      </w:r>
+    </w:p>
+    <w:p>
+      <w:pPr>
+        <w:pStyle w:val="ListParagraph"/>
+        <w:jc w:val="left"/>
+      </w:pPr>
+      <w:r>
+        <w:rPr/>
+        <w:t xml:space="preserve">Edit is the role on 270 of the 280 entries, so broad access includes modification, not just reading</w:t>
+      </w:r>
+    </w:p>
+    <w:p>
+      <w:pPr>
+        <w:pStyle w:val="ListParagraph"/>
+        <w:jc w:val="left"/>
+      </w:pPr>
+      <w:r>
+        <w:rPr/>
+        <w:t xml:space="preserve">The separate "Everyone" report returned a single entry: Read access at the root of the My Site Host web</w:t>
+      </w:r>
+    </w:p>
+    <w:p>
+      <w:pPr>
+        <w:pStyle w:val="ListParagraph"/>
+        <w:jc w:val="left"/>
+      </w:pPr>
+      <w:r>
+        <w:rPr/>
+        <w:t xml:space="preserve">Across the 11 OneDrives, 489 "Anyone" links and 10 organisation-wide links exist, along with 565 items with unique permissions and 42 guest permissions; the admin OneDrive carries 152 of the "Anyone" links</w:t>
+      </w:r>
+    </w:p>
+    <w:p>
+      <w:pPr>
+        <w:pStyle w:val="WarningBox"/>
+        <w:jc w:val="left"/>
+      </w:pPr>
+      <w:r>
+        <w:rPr/>
+        <w:t xml:space="preserve">"Anyone" links need review alongside the "Everyone except external users" findings. They allow access without sign-in and are the highest-priority clean-up item in the OneDrive data.</w:t>
       </w:r>
     </w:p>
     <w:p>
@@ -1945,7 +4993,7 @@
         <w:drawing>
           <wp:inline distT="0" distB="0" distL="0" distR="0">
             <wp:extent cx="5400000" cy="2538000"/>
-            <wp:docPr id="106" name="beforeafter.png" descr="Before and after structure"/>
+            <wp:docPr id="107" name="beforeafter.png" descr="Before and after structure"/>
             <wp:cNvGraphicFramePr>
               <a:graphicFrameLocks xmlns:a="http://schemas.openxmlformats.org/drawingml/2006/main" noChangeAspect="1"/>
             </wp:cNvGraphicFramePr>
@@ -1953,11 +5001,11 @@
               <a:graphicData uri="http://schemas.openxmlformats.org/drawingml/2006/picture">
                 <pic:pic xmlns:pic="http://schemas.openxmlformats.org/drawingml/2006/picture">
                   <pic:nvPicPr>
-                    <pic:cNvPr id="106" name="beforeafter.png"/>
+                    <pic:cNvPr id="107" name="beforeafter.png"/>
                     <pic:cNvPicPr/>
                   </pic:nvPicPr>
                   <pic:blipFill>
-                    <a:blip r:embed="rIdImg106"/>
+                    <a:blip r:embed="rIdImg107"/>
                     <a:stretch>
                       <a:fillRect/>
                     </a:stretch>
@@ -1990,7 +5038,7 @@
           <w:sz w:val="16"/>
           <w:szCs w:val="16"/>
         </w:rPr>
-        <w:t xml:space="preserve">Figure 5: Current versus future structure</w:t>
+        <w:t xml:space="preserve">Figure 6: Current versus future structure</w:t>
       </w:r>
     </w:p>
     <w:p>
@@ -2014,7 +5062,7 @@
         <w:drawing>
           <wp:inline distT="0" distB="0" distL="0" distR="0">
             <wp:extent cx="4860000" cy="3032640"/>
-            <wp:docPr id="107" name="intranet.png" descr="Modern intranet homepage mockup"/>
+            <wp:docPr id="108" name="intranet.png" descr="Modern intranet homepage mockup"/>
             <wp:cNvGraphicFramePr>
               <a:graphicFrameLocks xmlns:a="http://schemas.openxmlformats.org/drawingml/2006/main" noChangeAspect="1"/>
             </wp:cNvGraphicFramePr>
@@ -2022,11 +5070,11 @@
               <a:graphicData uri="http://schemas.openxmlformats.org/drawingml/2006/picture">
                 <pic:pic xmlns:pic="http://schemas.openxmlformats.org/drawingml/2006/picture">
                   <pic:nvPicPr>
-                    <pic:cNvPr id="107" name="intranet.png"/>
+                    <pic:cNvPr id="108" name="intranet.png"/>
                     <pic:cNvPicPr/>
                   </pic:nvPicPr>
                   <pic:blipFill>
-                    <a:blip r:embed="rIdImg107"/>
+                    <a:blip r:embed="rIdImg108"/>
                     <a:stretch>
                       <a:fillRect/>
                     </a:stretch>
@@ -2059,7 +5107,7 @@
           <w:sz w:val="16"/>
           <w:szCs w:val="16"/>
         </w:rPr>
-        <w:t xml:space="preserve">Figure 6: Advice Financial Hub concept mockup</w:t>
+        <w:t xml:space="preserve">Figure 7: Advice Financial Hub concept mockup</w:t>
       </w:r>
     </w:p>
     <w:p>
@@ -2106,7 +5154,7 @@
         <w:drawing>
           <wp:inline distT="0" distB="0" distL="0" distR="0">
             <wp:extent cx="5400000" cy="2205360"/>
-            <wp:docPr id="108" name="hub.png" descr="Hub architecture diagram"/>
+            <wp:docPr id="109" name="hub.png" descr="Hub architecture diagram"/>
             <wp:cNvGraphicFramePr>
               <a:graphicFrameLocks xmlns:a="http://schemas.openxmlformats.org/drawingml/2006/main" noChangeAspect="1"/>
             </wp:cNvGraphicFramePr>
@@ -2114,11 +5162,11 @@
               <a:graphicData uri="http://schemas.openxmlformats.org/drawingml/2006/picture">
                 <pic:pic xmlns:pic="http://schemas.openxmlformats.org/drawingml/2006/picture">
                   <pic:nvPicPr>
-                    <pic:cNvPr id="108" name="hub.png"/>
+                    <pic:cNvPr id="109" name="hub.png"/>
                     <pic:cNvPicPr/>
                   </pic:nvPicPr>
                   <pic:blipFill>
-                    <a:blip r:embed="rIdImg108"/>
+                    <a:blip r:embed="rIdImg109"/>
                     <a:stretch>
                       <a:fillRect/>
                     </a:stretch>
@@ -2151,7 +5199,7 @@
           <w:sz w:val="16"/>
           <w:szCs w:val="16"/>
         </w:rPr>
-        <w:t xml:space="preserve">Figure 7: Advice Financial Hub architecture</w:t>
+        <w:t xml:space="preserve">Figure 8: Advice Financial Hub architecture</w:t>
       </w:r>
     </w:p>
     <w:p>
@@ -2175,7 +5223,7 @@
         <w:drawing>
           <wp:inline distT="0" distB="0" distL="0" distR="0">
             <wp:extent cx="4860000" cy="2913927"/>
-            <wp:docPr id="109" name="records.png" descr="Client records security architecture"/>
+            <wp:docPr id="110" name="records.png" descr="Client records security architecture"/>
             <wp:cNvGraphicFramePr>
               <a:graphicFrameLocks xmlns:a="http://schemas.openxmlformats.org/drawingml/2006/main" noChangeAspect="1"/>
             </wp:cNvGraphicFramePr>
@@ -2183,11 +5231,11 @@
               <a:graphicData uri="http://schemas.openxmlformats.org/drawingml/2006/picture">
                 <pic:pic xmlns:pic="http://schemas.openxmlformats.org/drawingml/2006/picture">
                   <pic:nvPicPr>
-                    <pic:cNvPr id="109" name="records.png"/>
+                    <pic:cNvPr id="110" name="records.png"/>
                     <pic:cNvPicPr/>
                   </pic:nvPicPr>
                   <pic:blipFill>
-                    <a:blip r:embed="rIdImg109"/>
+                    <a:blip r:embed="rIdImg110"/>
                     <a:stretch>
                       <a:fillRect/>
                     </a:stretch>
@@ -2220,7 +5268,7 @@
           <w:sz w:val="16"/>
           <w:szCs w:val="16"/>
         </w:rPr>
-        <w:t xml:space="preserve">Figure 8: Client Records structure and security model</w:t>
+        <w:t xml:space="preserve">Figure 9: Client Records structure and security model</w:t>
       </w:r>
     </w:p>
     <w:p>
@@ -2267,7 +5315,7 @@
         <w:drawing>
           <wp:inline distT="0" distB="0" distL="0" distR="0">
             <wp:extent cx="5400000" cy="1872720"/>
-            <wp:docPr id="110" name="pillars.png" descr="Four pillar governance model"/>
+            <wp:docPr id="111" name="pillars.png" descr="Four pillar governance model"/>
             <wp:cNvGraphicFramePr>
               <a:graphicFrameLocks xmlns:a="http://schemas.openxmlformats.org/drawingml/2006/main" noChangeAspect="1"/>
             </wp:cNvGraphicFramePr>
@@ -2275,11 +5323,11 @@
               <a:graphicData uri="http://schemas.openxmlformats.org/drawingml/2006/picture">
                 <pic:pic xmlns:pic="http://schemas.openxmlformats.org/drawingml/2006/picture">
                   <pic:nvPicPr>
-                    <pic:cNvPr id="110" name="pillars.png"/>
+                    <pic:cNvPr id="111" name="pillars.png"/>
                     <pic:cNvPicPr/>
                   </pic:nvPicPr>
                   <pic:blipFill>
-                    <a:blip r:embed="rIdImg110"/>
+                    <a:blip r:embed="rIdImg111"/>
                     <a:stretch>
                       <a:fillRect/>
                     </a:stretch>
@@ -2312,7 +5360,7 @@
           <w:sz w:val="16"/>
           <w:szCs w:val="16"/>
         </w:rPr>
-        <w:t xml:space="preserve">Figure 9: Four-pillar governance model</w:t>
+        <w:t xml:space="preserve">Figure 10: Four-pillar governance model</w:t>
       </w:r>
     </w:p>
     <w:tbl>
@@ -2858,7 +5906,7 @@
         <w:drawing>
           <wp:inline distT="0" distB="0" distL="0" distR="0">
             <wp:extent cx="5400000" cy="2039040"/>
-            <wp:docPr id="111" name="timeline.png" descr="Five phase implementation roadmap"/>
+            <wp:docPr id="112" name="timeline.png" descr="Five phase implementation roadmap"/>
             <wp:cNvGraphicFramePr>
               <a:graphicFrameLocks xmlns:a="http://schemas.openxmlformats.org/drawingml/2006/main" noChangeAspect="1"/>
             </wp:cNvGraphicFramePr>
@@ -2866,11 +5914,11 @@
               <a:graphicData uri="http://schemas.openxmlformats.org/drawingml/2006/picture">
                 <pic:pic xmlns:pic="http://schemas.openxmlformats.org/drawingml/2006/picture">
                   <pic:nvPicPr>
-                    <pic:cNvPr id="111" name="timeline.png"/>
+                    <pic:cNvPr id="112" name="timeline.png"/>
                     <pic:cNvPicPr/>
                   </pic:nvPicPr>
                   <pic:blipFill>
-                    <a:blip r:embed="rIdImg111"/>
+                    <a:blip r:embed="rIdImg112"/>
                     <a:stretch>
                       <a:fillRect/>
                     </a:stretch>
@@ -2903,7 +5951,7 @@
           <w:sz w:val="16"/>
           <w:szCs w:val="16"/>
         </w:rPr>
-        <w:t xml:space="preserve">Figure 10: Implementation roadmap</w:t>
+        <w:t xml:space="preserve">Figure 11: Implementation roadmap</w:t>
       </w:r>
     </w:p>
     <w:tbl>
@@ -3196,7 +6244,7 @@
         <w:drawing>
           <wp:inline distT="0" distB="0" distL="0" distR="0">
             <wp:extent cx="5040000" cy="2524032"/>
-            <wp:docPr id="112" name="benefits.png" descr="Executive benefits"/>
+            <wp:docPr id="113" name="benefits.png" descr="Executive benefits"/>
             <wp:cNvGraphicFramePr>
               <a:graphicFrameLocks xmlns:a="http://schemas.openxmlformats.org/drawingml/2006/main" noChangeAspect="1"/>
             </wp:cNvGraphicFramePr>
@@ -3204,11 +6252,11 @@
               <a:graphicData uri="http://schemas.openxmlformats.org/drawingml/2006/picture">
                 <pic:pic xmlns:pic="http://schemas.openxmlformats.org/drawingml/2006/picture">
                   <pic:nvPicPr>
-                    <pic:cNvPr id="112" name="benefits.png"/>
+                    <pic:cNvPr id="113" name="benefits.png"/>
                     <pic:cNvPicPr/>
                   </pic:nvPicPr>
                   <pic:blipFill>
-                    <a:blip r:embed="rIdImg112"/>
+                    <a:blip r:embed="rIdImg113"/>
                     <a:stretch>
                       <a:fillRect/>
                     </a:stretch>
@@ -3241,7 +6289,7 @@
           <w:sz w:val="16"/>
           <w:szCs w:val="16"/>
         </w:rPr>
-        <w:t xml:space="preserve">Figure 11: Executive benefits</w:t>
+        <w:t xml:space="preserve">Figure 12: Executive benefits</w:t>
       </w:r>
     </w:p>
     <w:p>
@@ -3752,6 +6800,57 @@
       <w:r>
         <w:rPr/>
         <w:t xml:space="preserve">Dashboard-style visualisations</w:t>
+      </w:r>
+    </w:p>
+    <w:p>
+      <w:pPr>
+        <w:pStyle w:val="Heading2"/>
+        <w:keepNext/>
+        <w:spacing w:before="240" w:after="120"/>
+      </w:pPr>
+      <w:r>
+        <w:rPr/>
+        <w:t xml:space="preserve">Data Notes</w:t>
+      </w:r>
+    </w:p>
+    <w:p>
+      <w:pPr>
+        <w:pStyle w:val="ListParagraph"/>
+        <w:jc w:val="left"/>
+      </w:pPr>
+      <w:r>
+        <w:rPr/>
+        <w:t xml:space="preserve">Figures come from the five Excel reports supplied; the Sites_20261014225729869.xlsx report was not available for this revision</w:t>
+      </w:r>
+    </w:p>
+    <w:p>
+      <w:pPr>
+        <w:pStyle w:val="ListParagraph"/>
+        <w:jc w:val="left"/>
+      </w:pPr>
+      <w:r>
+        <w:rPr/>
+        <w:t xml:space="preserve">Reporting windows differ: the site list shows 236,539 files and 115 page views / 9 visits for AF Client Portal, while the 180-day usage report (refreshed 12 Oct 2026) shows 239,797 files, 352 page views and 15 visits</w:t>
+      </w:r>
+    </w:p>
+    <w:p>
+      <w:pPr>
+        <w:pStyle w:val="ListParagraph"/>
+        <w:jc w:val="left"/>
+      </w:pPr>
+      <w:r>
+        <w:rPr/>
+        <w:t xml:space="preserve">Client names and file paths from the sharing reports are deliberately excluded from this document; only counts are reported</w:t>
+      </w:r>
+    </w:p>
+    <w:p>
+      <w:pPr>
+        <w:pStyle w:val="ListParagraph"/>
+        <w:jc w:val="left"/>
+      </w:pPr>
+      <w:r>
+        <w:rPr/>
+        <w:t xml:space="preserve">The source reports do not flag which OneDrives are archived, so the "archived OneDrive" finding is carried over from the solution brief</w:t>
       </w:r>
     </w:p>
     <w:p>

</xml_diff>

<commit_message>
Add archived OneDrive data from Sites report
Co-Authored-By: Claude Sonnet 5.5 <noreply@anthropic.com>
Claude-Session: https://claude.ai/code/session_017ByFSMFKb6FYEauyGXdXkT
</commit_message>
<xml_diff>
--- a/Advice_Financial_SharePoint_Assessment.docx
+++ b/Advice_Financial_SharePoint_Assessment.docx
@@ -656,7 +656,7 @@
       </w:pPr>
       <w:r>
         <w:rPr/>
-        <w:t xml:space="preserve">Archived OneDrive repositories remain present within the tenant</w:t>
+        <w:t xml:space="preserve">Six archived OneDrive repositories (3.80 GB) remain in the tenant, all for unlicensed users and none scheduled for deletion</w:t>
       </w:r>
     </w:p>
     <w:p>
@@ -3752,6 +3752,690 @@
     </w:p>
     <w:p>
       <w:pPr>
+        <w:pStyle w:val="Heading3"/>
+        <w:keepNext/>
+      </w:pPr>
+      <w:r>
+        <w:rPr/>
+        <w:t xml:space="preserve">Archived OneDrive repositories</w:t>
+      </w:r>
+    </w:p>
+    <w:tbl>
+      <w:tblPr>
+        <w:tblStyle w:val="RicohTableStyle"/>
+        <w:tblW w:w="8929" w:type="dxa"/>
+        <w:tblLayout w:type="fixed"/>
+        <w:tblLook w:val="04A0" w:firstRow="1" w:lastRow="0" w:firstColumn="0" w:lastColumn="0" w:noHBand="0" w:noVBand="1"/>
+      </w:tblPr>
+      <w:tblGrid>
+        <w:gridCol w:w="3200"/>
+        <w:gridCol w:w="1700"/>
+        <w:gridCol w:w="2000"/>
+        <w:gridCol w:w="2029"/>
+      </w:tblGrid>
+      <w:tr>
+        <w:trPr>
+          <w:cantSplit/>
+          <w:tblHeader/>
+        </w:trPr>
+        <w:tc>
+          <w:tcPr>
+            <w:tcW w:w="3200" w:type="dxa"/>
+          </w:tcPr>
+          <w:p>
+            <w:pPr>
+              <w:spacing w:before="40" w:after="40"/>
+              <w:jc w:val="left"/>
+            </w:pPr>
+            <w:r>
+              <w:rPr>
+                <w:b/>
+                <w:color w:val="FFFFFF"/>
+                <w:sz w:val="20"/>
+                <w:szCs w:val="20"/>
+              </w:rPr>
+              <w:t xml:space="preserve">Account</w:t>
+            </w:r>
+          </w:p>
+        </w:tc>
+        <w:tc>
+          <w:tcPr>
+            <w:tcW w:w="1700" w:type="dxa"/>
+          </w:tcPr>
+          <w:p>
+            <w:pPr>
+              <w:spacing w:before="40" w:after="40"/>
+              <w:jc w:val="left"/>
+            </w:pPr>
+            <w:r>
+              <w:rPr>
+                <w:b/>
+                <w:color w:val="FFFFFF"/>
+                <w:sz w:val="20"/>
+                <w:szCs w:val="20"/>
+              </w:rPr>
+              <w:t xml:space="preserve">Storage (GB)</w:t>
+            </w:r>
+          </w:p>
+        </w:tc>
+        <w:tc>
+          <w:tcPr>
+            <w:tcW w:w="2000" w:type="dxa"/>
+          </w:tcPr>
+          <w:p>
+            <w:pPr>
+              <w:spacing w:before="40" w:after="40"/>
+              <w:jc w:val="left"/>
+            </w:pPr>
+            <w:r>
+              <w:rPr>
+                <w:b/>
+                <w:color w:val="FFFFFF"/>
+                <w:sz w:val="20"/>
+                <w:szCs w:val="20"/>
+              </w:rPr>
+              <w:t xml:space="preserve">Unlicensed on</w:t>
+            </w:r>
+          </w:p>
+        </w:tc>
+        <w:tc>
+          <w:tcPr>
+            <w:tcW w:w="2029" w:type="dxa"/>
+          </w:tcPr>
+          <w:p>
+            <w:pPr>
+              <w:spacing w:before="40" w:after="40"/>
+              <w:jc w:val="left"/>
+            </w:pPr>
+            <w:r>
+              <w:rPr>
+                <w:b/>
+                <w:color w:val="FFFFFF"/>
+                <w:sz w:val="20"/>
+                <w:szCs w:val="20"/>
+              </w:rPr>
+              <w:t xml:space="preserve">Archive status</w:t>
+            </w:r>
+          </w:p>
+        </w:tc>
+      </w:tr>
+      <w:tr>
+        <w:trPr>
+          <w:cantSplit/>
+        </w:trPr>
+        <w:tc>
+          <w:tcPr>
+            <w:tcW w:w="3200" w:type="dxa"/>
+          </w:tcPr>
+          <w:p>
+            <w:pPr>
+              <w:spacing w:before="40" w:after="40"/>
+              <w:jc w:val="left"/>
+            </w:pPr>
+            <w:r>
+              <w:rPr>
+                <w:sz w:val="20"/>
+                <w:szCs w:val="20"/>
+              </w:rPr>
+              <w:t xml:space="preserve">Haley McKenna</w:t>
+            </w:r>
+          </w:p>
+        </w:tc>
+        <w:tc>
+          <w:tcPr>
+            <w:tcW w:w="1700" w:type="dxa"/>
+          </w:tcPr>
+          <w:p>
+            <w:pPr>
+              <w:spacing w:before="40" w:after="40"/>
+              <w:jc w:val="left"/>
+            </w:pPr>
+            <w:r>
+              <w:rPr>
+                <w:sz w:val="20"/>
+                <w:szCs w:val="20"/>
+              </w:rPr>
+              <w:t xml:space="preserve">3.76</w:t>
+            </w:r>
+          </w:p>
+        </w:tc>
+        <w:tc>
+          <w:tcPr>
+            <w:tcW w:w="2000" w:type="dxa"/>
+          </w:tcPr>
+          <w:p>
+            <w:pPr>
+              <w:spacing w:before="40" w:after="40"/>
+              <w:jc w:val="left"/>
+            </w:pPr>
+            <w:r>
+              <w:rPr>
+                <w:sz w:val="20"/>
+                <w:szCs w:val="20"/>
+              </w:rPr>
+              <w:t xml:space="preserve">1 Oct 2026</w:t>
+            </w:r>
+          </w:p>
+        </w:tc>
+        <w:tc>
+          <w:tcPr>
+            <w:tcW w:w="2029" w:type="dxa"/>
+          </w:tcPr>
+          <w:p>
+            <w:pPr>
+              <w:spacing w:before="40" w:after="40"/>
+              <w:jc w:val="left"/>
+            </w:pPr>
+            <w:r>
+              <w:rPr>
+                <w:sz w:val="20"/>
+                <w:szCs w:val="20"/>
+              </w:rPr>
+              <w:t xml:space="preserve">Archived</w:t>
+            </w:r>
+          </w:p>
+        </w:tc>
+      </w:tr>
+      <w:tr>
+        <w:trPr>
+          <w:cantSplit/>
+        </w:trPr>
+        <w:tc>
+          <w:tcPr>
+            <w:tcW w:w="3200" w:type="dxa"/>
+          </w:tcPr>
+          <w:p>
+            <w:pPr>
+              <w:spacing w:before="40" w:after="40"/>
+              <w:jc w:val="left"/>
+            </w:pPr>
+            <w:r>
+              <w:rPr>
+                <w:sz w:val="20"/>
+                <w:szCs w:val="20"/>
+              </w:rPr>
+              <w:t xml:space="preserve">Kirsty Mcalpine</w:t>
+            </w:r>
+          </w:p>
+        </w:tc>
+        <w:tc>
+          <w:tcPr>
+            <w:tcW w:w="1700" w:type="dxa"/>
+          </w:tcPr>
+          <w:p>
+            <w:pPr>
+              <w:spacing w:before="40" w:after="40"/>
+              <w:jc w:val="left"/>
+            </w:pPr>
+            <w:r>
+              <w:rPr>
+                <w:sz w:val="20"/>
+                <w:szCs w:val="20"/>
+              </w:rPr>
+              <w:t xml:space="preserve">0.02</w:t>
+            </w:r>
+          </w:p>
+        </w:tc>
+        <w:tc>
+          <w:tcPr>
+            <w:tcW w:w="2000" w:type="dxa"/>
+          </w:tcPr>
+          <w:p>
+            <w:pPr>
+              <w:spacing w:before="40" w:after="40"/>
+              <w:jc w:val="left"/>
+            </w:pPr>
+            <w:r>
+              <w:rPr>
+                <w:sz w:val="20"/>
+                <w:szCs w:val="20"/>
+              </w:rPr>
+              <w:t xml:space="preserve">14 Dec 2023</w:t>
+            </w:r>
+          </w:p>
+        </w:tc>
+        <w:tc>
+          <w:tcPr>
+            <w:tcW w:w="2029" w:type="dxa"/>
+          </w:tcPr>
+          <w:p>
+            <w:pPr>
+              <w:spacing w:before="40" w:after="40"/>
+              <w:jc w:val="left"/>
+            </w:pPr>
+            <w:r>
+              <w:rPr>
+                <w:sz w:val="20"/>
+                <w:szCs w:val="20"/>
+              </w:rPr>
+              <w:t xml:space="preserve">Archived</w:t>
+            </w:r>
+          </w:p>
+        </w:tc>
+      </w:tr>
+      <w:tr>
+        <w:trPr>
+          <w:cantSplit/>
+        </w:trPr>
+        <w:tc>
+          <w:tcPr>
+            <w:tcW w:w="3200" w:type="dxa"/>
+          </w:tcPr>
+          <w:p>
+            <w:pPr>
+              <w:spacing w:before="40" w:after="40"/>
+              <w:jc w:val="left"/>
+            </w:pPr>
+            <w:r>
+              <w:rPr>
+                <w:sz w:val="20"/>
+                <w:szCs w:val="20"/>
+              </w:rPr>
+              <w:t xml:space="preserve">Charlotte Fouhy</w:t>
+            </w:r>
+          </w:p>
+        </w:tc>
+        <w:tc>
+          <w:tcPr>
+            <w:tcW w:w="1700" w:type="dxa"/>
+          </w:tcPr>
+          <w:p>
+            <w:pPr>
+              <w:spacing w:before="40" w:after="40"/>
+              <w:jc w:val="left"/>
+            </w:pPr>
+            <w:r>
+              <w:rPr>
+                <w:sz w:val="20"/>
+                <w:szCs w:val="20"/>
+              </w:rPr>
+              <w:t xml:space="preserve">0.02</w:t>
+            </w:r>
+          </w:p>
+        </w:tc>
+        <w:tc>
+          <w:tcPr>
+            <w:tcW w:w="2000" w:type="dxa"/>
+          </w:tcPr>
+          <w:p>
+            <w:pPr>
+              <w:spacing w:before="40" w:after="40"/>
+              <w:jc w:val="left"/>
+            </w:pPr>
+            <w:r>
+              <w:rPr>
+                <w:sz w:val="20"/>
+                <w:szCs w:val="20"/>
+              </w:rPr>
+              <w:t xml:space="preserve">6 Sep 2025</w:t>
+            </w:r>
+          </w:p>
+        </w:tc>
+        <w:tc>
+          <w:tcPr>
+            <w:tcW w:w="2029" w:type="dxa"/>
+          </w:tcPr>
+          <w:p>
+            <w:pPr>
+              <w:spacing w:before="40" w:after="40"/>
+              <w:jc w:val="left"/>
+            </w:pPr>
+            <w:r>
+              <w:rPr>
+                <w:sz w:val="20"/>
+                <w:szCs w:val="20"/>
+              </w:rPr>
+              <w:t xml:space="preserve">Archived</w:t>
+            </w:r>
+          </w:p>
+        </w:tc>
+      </w:tr>
+      <w:tr>
+        <w:trPr>
+          <w:cantSplit/>
+        </w:trPr>
+        <w:tc>
+          <w:tcPr>
+            <w:tcW w:w="3200" w:type="dxa"/>
+          </w:tcPr>
+          <w:p>
+            <w:pPr>
+              <w:spacing w:before="40" w:after="40"/>
+              <w:jc w:val="left"/>
+            </w:pPr>
+            <w:r>
+              <w:rPr>
+                <w:sz w:val="20"/>
+                <w:szCs w:val="20"/>
+              </w:rPr>
+              <w:t xml:space="preserve">Moira Irving</w:t>
+            </w:r>
+          </w:p>
+        </w:tc>
+        <w:tc>
+          <w:tcPr>
+            <w:tcW w:w="1700" w:type="dxa"/>
+          </w:tcPr>
+          <w:p>
+            <w:pPr>
+              <w:spacing w:before="40" w:after="40"/>
+              <w:jc w:val="left"/>
+            </w:pPr>
+            <w:r>
+              <w:rPr>
+                <w:sz w:val="20"/>
+                <w:szCs w:val="20"/>
+              </w:rPr>
+              <w:t xml:space="preserve">0</w:t>
+            </w:r>
+          </w:p>
+        </w:tc>
+        <w:tc>
+          <w:tcPr>
+            <w:tcW w:w="2000" w:type="dxa"/>
+          </w:tcPr>
+          <w:p>
+            <w:pPr>
+              <w:spacing w:before="40" w:after="40"/>
+              <w:jc w:val="left"/>
+            </w:pPr>
+            <w:r>
+              <w:rPr>
+                <w:sz w:val="20"/>
+                <w:szCs w:val="20"/>
+              </w:rPr>
+              <w:t xml:space="preserve">14 Dec 2023</w:t>
+            </w:r>
+          </w:p>
+        </w:tc>
+        <w:tc>
+          <w:tcPr>
+            <w:tcW w:w="2029" w:type="dxa"/>
+          </w:tcPr>
+          <w:p>
+            <w:pPr>
+              <w:spacing w:before="40" w:after="40"/>
+              <w:jc w:val="left"/>
+            </w:pPr>
+            <w:r>
+              <w:rPr>
+                <w:sz w:val="20"/>
+                <w:szCs w:val="20"/>
+              </w:rPr>
+              <w:t xml:space="preserve">Archived</w:t>
+            </w:r>
+          </w:p>
+        </w:tc>
+      </w:tr>
+      <w:tr>
+        <w:trPr>
+          <w:cantSplit/>
+        </w:trPr>
+        <w:tc>
+          <w:tcPr>
+            <w:tcW w:w="3200" w:type="dxa"/>
+          </w:tcPr>
+          <w:p>
+            <w:pPr>
+              <w:spacing w:before="40" w:after="40"/>
+              <w:jc w:val="left"/>
+            </w:pPr>
+            <w:r>
+              <w:rPr>
+                <w:sz w:val="20"/>
+                <w:szCs w:val="20"/>
+              </w:rPr>
+              <w:t xml:space="preserve">Elive Admin</w:t>
+            </w:r>
+          </w:p>
+        </w:tc>
+        <w:tc>
+          <w:tcPr>
+            <w:tcW w:w="1700" w:type="dxa"/>
+          </w:tcPr>
+          <w:p>
+            <w:pPr>
+              <w:spacing w:before="40" w:after="40"/>
+              <w:jc w:val="left"/>
+            </w:pPr>
+            <w:r>
+              <w:rPr>
+                <w:sz w:val="20"/>
+                <w:szCs w:val="20"/>
+              </w:rPr>
+              <w:t xml:space="preserve">0</w:t>
+            </w:r>
+          </w:p>
+        </w:tc>
+        <w:tc>
+          <w:tcPr>
+            <w:tcW w:w="2000" w:type="dxa"/>
+          </w:tcPr>
+          <w:p>
+            <w:pPr>
+              <w:spacing w:before="40" w:after="40"/>
+              <w:jc w:val="left"/>
+            </w:pPr>
+            <w:r>
+              <w:rPr>
+                <w:sz w:val="20"/>
+                <w:szCs w:val="20"/>
+              </w:rPr>
+              <w:t xml:space="preserve">1 Jul 2026</w:t>
+            </w:r>
+          </w:p>
+        </w:tc>
+        <w:tc>
+          <w:tcPr>
+            <w:tcW w:w="2029" w:type="dxa"/>
+          </w:tcPr>
+          <w:p>
+            <w:pPr>
+              <w:spacing w:before="40" w:after="40"/>
+              <w:jc w:val="left"/>
+            </w:pPr>
+            <w:r>
+              <w:rPr>
+                <w:sz w:val="20"/>
+                <w:szCs w:val="20"/>
+              </w:rPr>
+              <w:t xml:space="preserve">Archived</w:t>
+            </w:r>
+          </w:p>
+        </w:tc>
+      </w:tr>
+      <w:tr>
+        <w:trPr>
+          <w:cantSplit/>
+        </w:trPr>
+        <w:tc>
+          <w:tcPr>
+            <w:tcW w:w="3200" w:type="dxa"/>
+          </w:tcPr>
+          <w:p>
+            <w:pPr>
+              <w:spacing w:before="40" w:after="40"/>
+              <w:jc w:val="left"/>
+            </w:pPr>
+            <w:r>
+              <w:rPr>
+                <w:sz w:val="20"/>
+                <w:szCs w:val="20"/>
+              </w:rPr>
+              <w:t xml:space="preserve">Lesley Dockery (Inactive)</w:t>
+            </w:r>
+          </w:p>
+        </w:tc>
+        <w:tc>
+          <w:tcPr>
+            <w:tcW w:w="1700" w:type="dxa"/>
+          </w:tcPr>
+          <w:p>
+            <w:pPr>
+              <w:spacing w:before="40" w:after="40"/>
+              <w:jc w:val="left"/>
+            </w:pPr>
+            <w:r>
+              <w:rPr>
+                <w:sz w:val="20"/>
+                <w:szCs w:val="20"/>
+              </w:rPr>
+              <w:t xml:space="preserve">0</w:t>
+            </w:r>
+          </w:p>
+        </w:tc>
+        <w:tc>
+          <w:tcPr>
+            <w:tcW w:w="2000" w:type="dxa"/>
+          </w:tcPr>
+          <w:p>
+            <w:pPr>
+              <w:spacing w:before="40" w:after="40"/>
+              <w:jc w:val="left"/>
+            </w:pPr>
+            <w:r>
+              <w:rPr>
+                <w:sz w:val="20"/>
+                <w:szCs w:val="20"/>
+              </w:rPr>
+              <w:t xml:space="preserve">29 May 2026</w:t>
+            </w:r>
+          </w:p>
+        </w:tc>
+        <w:tc>
+          <w:tcPr>
+            <w:tcW w:w="2029" w:type="dxa"/>
+          </w:tcPr>
+          <w:p>
+            <w:pPr>
+              <w:spacing w:before="40" w:after="40"/>
+              <w:jc w:val="left"/>
+            </w:pPr>
+            <w:r>
+              <w:rPr>
+                <w:sz w:val="20"/>
+                <w:szCs w:val="20"/>
+              </w:rPr>
+              <w:t xml:space="preserve">Archived</w:t>
+            </w:r>
+          </w:p>
+        </w:tc>
+      </w:tr>
+      <w:tr>
+        <w:trPr>
+          <w:cantSplit/>
+        </w:trPr>
+        <w:tc>
+          <w:tcPr>
+            <w:tcW w:w="3200" w:type="dxa"/>
+          </w:tcPr>
+          <w:p>
+            <w:pPr>
+              <w:spacing w:before="40" w:after="40"/>
+              <w:jc w:val="left"/>
+            </w:pPr>
+            <w:r>
+              <w:rPr>
+                <w:sz w:val="20"/>
+                <w:szCs w:val="20"/>
+              </w:rPr>
+              <w:t xml:space="preserve">Total (6 accounts)</w:t>
+            </w:r>
+          </w:p>
+        </w:tc>
+        <w:tc>
+          <w:tcPr>
+            <w:tcW w:w="1700" w:type="dxa"/>
+          </w:tcPr>
+          <w:p>
+            <w:pPr>
+              <w:spacing w:before="40" w:after="40"/>
+              <w:jc w:val="left"/>
+            </w:pPr>
+            <w:r>
+              <w:rPr>
+                <w:sz w:val="20"/>
+                <w:szCs w:val="20"/>
+              </w:rPr>
+              <w:t xml:space="preserve">3.80</w:t>
+            </w:r>
+          </w:p>
+        </w:tc>
+        <w:tc>
+          <w:tcPr>
+            <w:tcW w:w="2000" w:type="dxa"/>
+          </w:tcPr>
+          <w:p>
+            <w:pPr>
+              <w:spacing w:before="40" w:after="40"/>
+              <w:jc w:val="left"/>
+            </w:pPr>
+            <w:r>
+              <w:rPr>
+                <w:sz w:val="20"/>
+                <w:szCs w:val="20"/>
+              </w:rPr>
+              <w:t xml:space="preserve"/>
+            </w:r>
+          </w:p>
+        </w:tc>
+        <w:tc>
+          <w:tcPr>
+            <w:tcW w:w="2029" w:type="dxa"/>
+          </w:tcPr>
+          <w:p>
+            <w:pPr>
+              <w:spacing w:before="40" w:after="40"/>
+              <w:jc w:val="left"/>
+            </w:pPr>
+            <w:r>
+              <w:rPr>
+                <w:sz w:val="20"/>
+                <w:szCs w:val="20"/>
+              </w:rPr>
+              <w:t xml:space="preserve"/>
+            </w:r>
+          </w:p>
+        </w:tc>
+      </w:tr>
+    </w:tbl>
+    <w:p>
+      <w:pPr>
+        <w:spacing w:after="120"/>
+      </w:pPr>
+    </w:p>
+    <w:p>
+      <w:pPr>
+        <w:pStyle w:val="ListParagraph"/>
+        <w:jc w:val="left"/>
+      </w:pPr>
+      <w:r>
+        <w:rPr/>
+        <w:t xml:space="preserve">All six were unlicensed by an admin (licence removed) and have the status Archived</w:t>
+      </w:r>
+    </w:p>
+    <w:p>
+      <w:pPr>
+        <w:pStyle w:val="ListParagraph"/>
+        <w:jc w:val="left"/>
+      </w:pPr>
+      <w:r>
+        <w:rPr/>
+        <w:t xml:space="preserve">Deletion is blocked on each because the owner is still active in Entra ID, and none has a deletion date scheduled</w:t>
+      </w:r>
+    </w:p>
+    <w:p>
+      <w:pPr>
+        <w:pStyle w:val="ListParagraph"/>
+        <w:jc w:val="left"/>
+      </w:pPr>
+      <w:r>
+        <w:rPr/>
+        <w:t xml:space="preserve">The archived accounts hold little data, but they stay as unreviewed repositories with no named owner or retention decision</w:t>
+      </w:r>
+    </w:p>
+    <w:p>
+      <w:pPr>
         <w:keepNext/>
         <w:spacing w:before="120" w:after="60"/>
         <w:jc w:val="center"/>
@@ -6820,7 +7504,7 @@
       </w:pPr>
       <w:r>
         <w:rPr/>
-        <w:t xml:space="preserve">Figures come from the five Excel reports supplied; the Sites_20261014225729869.xlsx report was not available for this revision</w:t>
+        <w:t xml:space="preserve">Figures come from the six Excel reports supplied, including Sites_20261014225729869.xlsx for the archived OneDrive repositories</w:t>
       </w:r>
     </w:p>
     <w:p>
@@ -6841,16 +7525,6 @@
       <w:r>
         <w:rPr/>
         <w:t xml:space="preserve">Client names and file paths from the sharing reports are deliberately excluded from this document; only counts are reported</w:t>
-      </w:r>
-    </w:p>
-    <w:p>
-      <w:pPr>
-        <w:pStyle w:val="ListParagraph"/>
-        <w:jc w:val="left"/>
-      </w:pPr>
-      <w:r>
-        <w:rPr/>
-        <w:t xml:space="preserve">The source reports do not flag which OneDrives are archived, so the "archived OneDrive" finding is carried over from the solution brief</w:t>
       </w:r>
     </w:p>
     <w:p>

</xml_diff>